<commit_message>
add react notes second section incomplete, needs revision
</commit_message>
<xml_diff>
--- a/practice_profile/React Notes.docx
+++ b/practice_profile/React Notes.docx
@@ -1562,6 +1562,129 @@
           <w:szCs w:val="22"/>
         </w:rPr>
         <w:t>arrayName[0] this will always get us the first message (latest)</w:t>
+      </w:r>
+    </w:p>
+    <w:p>
+      <w:pPr>
+        <w:rPr>
+          <w:color w:val="000000" w:themeColor="text1"/>
+          <w:sz w:val="22"/>
+          <w:szCs w:val="22"/>
+        </w:rPr>
+      </w:pPr>
+    </w:p>
+    <w:p>
+      <w:pPr>
+        <w:rPr>
+          <w:b/>
+          <w:bCs/>
+          <w:color w:val="000000" w:themeColor="text1"/>
+          <w:u w:val="single"/>
+        </w:rPr>
+      </w:pPr>
+      <w:r>
+        <w:rPr>
+          <w:b/>
+          <w:bCs/>
+          <w:color w:val="000000" w:themeColor="text1"/>
+          <w:u w:val="single"/>
+        </w:rPr>
+        <w:lastRenderedPageBreak/>
+        <w:t>getting input from a text box using the dom:</w:t>
+      </w:r>
+    </w:p>
+    <w:p>
+      <w:pPr>
+        <w:rPr>
+          <w:color w:val="000000" w:themeColor="text1"/>
+          <w:sz w:val="22"/>
+          <w:szCs w:val="22"/>
+        </w:rPr>
+      </w:pPr>
+      <w:r>
+        <w:rPr>
+          <w:color w:val="000000" w:themeColor="text1"/>
+          <w:sz w:val="22"/>
+          <w:szCs w:val="22"/>
+        </w:rPr>
+        <w:t>it’s the best practice to not use the DOM manually</w:t>
+      </w:r>
+    </w:p>
+    <w:p>
+      <w:pPr>
+        <w:rPr>
+          <w:color w:val="000000" w:themeColor="text1"/>
+          <w:sz w:val="22"/>
+          <w:szCs w:val="22"/>
+        </w:rPr>
+      </w:pPr>
+      <w:r>
+        <w:rPr>
+          <w:color w:val="000000" w:themeColor="text1"/>
+          <w:sz w:val="22"/>
+          <w:szCs w:val="22"/>
+        </w:rPr>
+        <w:t>onChange runs a function when we change the text inside the input box</w:t>
+      </w:r>
+      <w:r>
+        <w:rPr>
+          <w:color w:val="000000" w:themeColor="text1"/>
+          <w:sz w:val="22"/>
+          <w:szCs w:val="22"/>
+        </w:rPr>
+        <w:t xml:space="preserve"> &lt;input&gt;</w:t>
+      </w:r>
+    </w:p>
+    <w:p>
+      <w:pPr>
+        <w:rPr>
+          <w:color w:val="000000" w:themeColor="text1"/>
+          <w:sz w:val="22"/>
+          <w:szCs w:val="22"/>
+        </w:rPr>
+      </w:pPr>
+      <w:r>
+        <w:rPr>
+          <w:color w:val="000000" w:themeColor="text1"/>
+          <w:sz w:val="22"/>
+          <w:szCs w:val="22"/>
+        </w:rPr>
+        <w:t>we use state in react to save the data that changes over time</w:t>
+      </w:r>
+    </w:p>
+    <w:p>
+      <w:pPr>
+        <w:rPr>
+          <w:color w:val="000000" w:themeColor="text1"/>
+          <w:sz w:val="22"/>
+          <w:szCs w:val="22"/>
+        </w:rPr>
+      </w:pPr>
+    </w:p>
+    <w:p>
+      <w:pPr>
+        <w:rPr>
+          <w:color w:val="000000" w:themeColor="text1"/>
+          <w:sz w:val="22"/>
+          <w:szCs w:val="22"/>
+        </w:rPr>
+      </w:pPr>
+    </w:p>
+    <w:p>
+      <w:pPr>
+        <w:rPr>
+          <w:color w:val="000000" w:themeColor="text1"/>
+          <w:sz w:val="22"/>
+          <w:szCs w:val="22"/>
+        </w:rPr>
+      </w:pPr>
+      <w:r>
+        <w:rPr>
+          <w:color w:val="000000" w:themeColor="text1"/>
+          <w:sz w:val="22"/>
+          <w:szCs w:val="22"/>
+        </w:rPr>
+        <w:t>lifting the state up</w:t>
       </w:r>
     </w:p>
     <w:sectPr>

</xml_diff>

<commit_message>
add react notes with css and hooks
</commit_message>
<xml_diff>
--- a/practice_profile/React Notes.docx
+++ b/practice_profile/React Notes.docx
@@ -113,24 +113,78 @@
           <w:sz w:val="22"/>
           <w:szCs w:val="22"/>
         </w:rPr>
-        <w:t xml:space="preserve">his line just looks for the container called .js-container: </w:t>
-      </w:r>
-    </w:p>
-    <w:p>
-      <w:pPr>
-        <w:rPr>
-          <w:color w:val="EE0000"/>
-          <w:sz w:val="22"/>
-          <w:szCs w:val="22"/>
-        </w:rPr>
-      </w:pPr>
-      <w:r>
-        <w:rPr>
-          <w:color w:val="EE0000"/>
-          <w:sz w:val="22"/>
-          <w:szCs w:val="22"/>
-        </w:rPr>
-        <w:t xml:space="preserve">const container = document.querySelector('.js-container'); </w:t>
+        <w:t>his line just looks for the container called .</w:t>
+      </w:r>
+      <w:proofErr w:type="spellStart"/>
+      <w:r>
+        <w:rPr>
+          <w:sz w:val="22"/>
+          <w:szCs w:val="22"/>
+        </w:rPr>
+        <w:t>js</w:t>
+      </w:r>
+      <w:proofErr w:type="spellEnd"/>
+      <w:r>
+        <w:rPr>
+          <w:sz w:val="22"/>
+          <w:szCs w:val="22"/>
+        </w:rPr>
+        <w:t xml:space="preserve">-container: </w:t>
+      </w:r>
+    </w:p>
+    <w:p>
+      <w:pPr>
+        <w:rPr>
+          <w:color w:val="EE0000"/>
+          <w:sz w:val="22"/>
+          <w:szCs w:val="22"/>
+        </w:rPr>
+      </w:pPr>
+      <w:r>
+        <w:rPr>
+          <w:color w:val="EE0000"/>
+          <w:sz w:val="22"/>
+          <w:szCs w:val="22"/>
+        </w:rPr>
+        <w:t xml:space="preserve">const container = </w:t>
+      </w:r>
+      <w:proofErr w:type="spellStart"/>
+      <w:proofErr w:type="gramStart"/>
+      <w:r>
+        <w:rPr>
+          <w:color w:val="EE0000"/>
+          <w:sz w:val="22"/>
+          <w:szCs w:val="22"/>
+        </w:rPr>
+        <w:t>document.querySelector</w:t>
+      </w:r>
+      <w:proofErr w:type="spellEnd"/>
+      <w:proofErr w:type="gramEnd"/>
+      <w:r>
+        <w:rPr>
+          <w:color w:val="EE0000"/>
+          <w:sz w:val="22"/>
+          <w:szCs w:val="22"/>
+        </w:rPr>
+        <w:t>('.</w:t>
+      </w:r>
+      <w:proofErr w:type="spellStart"/>
+      <w:r>
+        <w:rPr>
+          <w:color w:val="EE0000"/>
+          <w:sz w:val="22"/>
+          <w:szCs w:val="22"/>
+        </w:rPr>
+        <w:t>js</w:t>
+      </w:r>
+      <w:proofErr w:type="spellEnd"/>
+      <w:r>
+        <w:rPr>
+          <w:color w:val="EE0000"/>
+          <w:sz w:val="22"/>
+          <w:szCs w:val="22"/>
+        </w:rPr>
+        <w:t xml:space="preserve">-container'); </w:t>
       </w:r>
     </w:p>
     <w:p>
@@ -160,7 +214,23 @@
           <w:sz w:val="22"/>
           <w:szCs w:val="22"/>
         </w:rPr>
-        <w:t>then when we render we will fill that container aka div</w:t>
+        <w:t xml:space="preserve">then when we </w:t>
+      </w:r>
+      <w:proofErr w:type="gramStart"/>
+      <w:r>
+        <w:rPr>
+          <w:sz w:val="22"/>
+          <w:szCs w:val="22"/>
+        </w:rPr>
+        <w:t>render</w:t>
+      </w:r>
+      <w:proofErr w:type="gramEnd"/>
+      <w:r>
+        <w:rPr>
+          <w:sz w:val="22"/>
+          <w:szCs w:val="22"/>
+        </w:rPr>
+        <w:t xml:space="preserve"> we will fill that container aka div</w:t>
       </w:r>
     </w:p>
     <w:p>
@@ -207,13 +277,41 @@
         </w:rPr>
         <w:t xml:space="preserve">tainer for this line we chose the app component: </w:t>
       </w:r>
-      <w:r>
-        <w:rPr>
-          <w:color w:val="EE0000"/>
-          <w:sz w:val="22"/>
-          <w:szCs w:val="22"/>
-        </w:rPr>
-        <w:t>ReactDOM.createRoot(container).render(&lt;App /&gt;);</w:t>
+      <w:proofErr w:type="spellStart"/>
+      <w:r>
+        <w:rPr>
+          <w:color w:val="EE0000"/>
+          <w:sz w:val="22"/>
+          <w:szCs w:val="22"/>
+        </w:rPr>
+        <w:t>ReactDOM.createRoot</w:t>
+      </w:r>
+      <w:proofErr w:type="spellEnd"/>
+      <w:r>
+        <w:rPr>
+          <w:color w:val="EE0000"/>
+          <w:sz w:val="22"/>
+          <w:szCs w:val="22"/>
+        </w:rPr>
+        <w:t>(container</w:t>
+      </w:r>
+      <w:proofErr w:type="gramStart"/>
+      <w:r>
+        <w:rPr>
+          <w:color w:val="EE0000"/>
+          <w:sz w:val="22"/>
+          <w:szCs w:val="22"/>
+        </w:rPr>
+        <w:t>).render</w:t>
+      </w:r>
+      <w:proofErr w:type="gramEnd"/>
+      <w:r>
+        <w:rPr>
+          <w:color w:val="EE0000"/>
+          <w:sz w:val="22"/>
+          <w:szCs w:val="22"/>
+        </w:rPr>
+        <w:t>(&lt;App /&gt;);</w:t>
       </w:r>
     </w:p>
     <w:p>
@@ -265,8 +363,54 @@
           <w:sz w:val="22"/>
           <w:szCs w:val="22"/>
         </w:rPr>
-        <w:t>we include the babel cause it translates other programming languages or non programming languages into javascript</w:t>
-      </w:r>
+        <w:t xml:space="preserve">we include the babel </w:t>
+      </w:r>
+      <w:proofErr w:type="gramStart"/>
+      <w:r>
+        <w:rPr>
+          <w:color w:val="000000" w:themeColor="text1"/>
+          <w:sz w:val="22"/>
+          <w:szCs w:val="22"/>
+        </w:rPr>
+        <w:t>cause</w:t>
+      </w:r>
+      <w:proofErr w:type="gramEnd"/>
+      <w:r>
+        <w:rPr>
+          <w:color w:val="000000" w:themeColor="text1"/>
+          <w:sz w:val="22"/>
+          <w:szCs w:val="22"/>
+        </w:rPr>
+        <w:t xml:space="preserve"> it translates other programming languages or </w:t>
+      </w:r>
+      <w:proofErr w:type="spellStart"/>
+      <w:r>
+        <w:rPr>
+          <w:color w:val="000000" w:themeColor="text1"/>
+          <w:sz w:val="22"/>
+          <w:szCs w:val="22"/>
+        </w:rPr>
+        <w:t>non programming</w:t>
+      </w:r>
+      <w:proofErr w:type="spellEnd"/>
+      <w:r>
+        <w:rPr>
+          <w:color w:val="000000" w:themeColor="text1"/>
+          <w:sz w:val="22"/>
+          <w:szCs w:val="22"/>
+        </w:rPr>
+        <w:t xml:space="preserve"> languages into </w:t>
+      </w:r>
+      <w:proofErr w:type="spellStart"/>
+      <w:r>
+        <w:rPr>
+          <w:color w:val="000000" w:themeColor="text1"/>
+          <w:sz w:val="22"/>
+          <w:szCs w:val="22"/>
+        </w:rPr>
+        <w:t>javascript</w:t>
+      </w:r>
+      <w:proofErr w:type="spellEnd"/>
       <w:r>
         <w:rPr>
           <w:color w:val="000000" w:themeColor="text1"/>
@@ -314,59 +458,169 @@
           <w:sz w:val="22"/>
           <w:szCs w:val="22"/>
         </w:rPr>
-        <w:t xml:space="preserve"> myButton = &lt;button&gt;press me&lt;/button&gt;</w:t>
-      </w:r>
-    </w:p>
-    <w:p>
-      <w:pPr>
-        <w:rPr>
-          <w:color w:val="EE0000"/>
-          <w:sz w:val="22"/>
-          <w:szCs w:val="22"/>
-        </w:rPr>
-      </w:pPr>
-    </w:p>
-    <w:p>
-      <w:pPr>
-        <w:rPr>
-          <w:color w:val="000000" w:themeColor="text1"/>
-          <w:sz w:val="22"/>
-          <w:szCs w:val="22"/>
-        </w:rPr>
-      </w:pPr>
-      <w:r>
-        <w:rPr>
-          <w:color w:val="000000" w:themeColor="text1"/>
-          <w:sz w:val="22"/>
-          <w:szCs w:val="22"/>
-        </w:rPr>
-        <w:t>to display things we use the .render() however we cant pass multiple elements inside it, what we can do is to create a div and save it into a javascript variable and this variable we pass to the render.</w:t>
-      </w:r>
-    </w:p>
-    <w:p>
-      <w:pPr>
-        <w:rPr>
-          <w:color w:val="000000" w:themeColor="text1"/>
-          <w:sz w:val="22"/>
-          <w:szCs w:val="22"/>
-        </w:rPr>
-      </w:pPr>
-    </w:p>
-    <w:p>
-      <w:pPr>
-        <w:rPr>
-          <w:color w:val="000000" w:themeColor="text1"/>
-          <w:sz w:val="22"/>
-          <w:szCs w:val="22"/>
-        </w:rPr>
-      </w:pPr>
-      <w:r>
-        <w:rPr>
-          <w:color w:val="000000" w:themeColor="text1"/>
-          <w:sz w:val="22"/>
-          <w:szCs w:val="22"/>
-        </w:rPr>
-        <w:t>when we have multiple elements in html saved to a JS constant or variable it’s the best practice to surround them with ( ).</w:t>
+        <w:t xml:space="preserve"> </w:t>
+      </w:r>
+      <w:proofErr w:type="spellStart"/>
+      <w:r>
+        <w:rPr>
+          <w:color w:val="EE0000"/>
+          <w:sz w:val="22"/>
+          <w:szCs w:val="22"/>
+        </w:rPr>
+        <w:t>myButton</w:t>
+      </w:r>
+      <w:proofErr w:type="spellEnd"/>
+      <w:r>
+        <w:rPr>
+          <w:color w:val="EE0000"/>
+          <w:sz w:val="22"/>
+          <w:szCs w:val="22"/>
+        </w:rPr>
+        <w:t xml:space="preserve"> = &lt;button&gt;press me&lt;/button&gt;</w:t>
+      </w:r>
+    </w:p>
+    <w:p>
+      <w:pPr>
+        <w:rPr>
+          <w:color w:val="EE0000"/>
+          <w:sz w:val="22"/>
+          <w:szCs w:val="22"/>
+        </w:rPr>
+      </w:pPr>
+    </w:p>
+    <w:p>
+      <w:pPr>
+        <w:rPr>
+          <w:color w:val="000000" w:themeColor="text1"/>
+          <w:sz w:val="22"/>
+          <w:szCs w:val="22"/>
+        </w:rPr>
+      </w:pPr>
+      <w:r>
+        <w:rPr>
+          <w:color w:val="000000" w:themeColor="text1"/>
+          <w:sz w:val="22"/>
+          <w:szCs w:val="22"/>
+        </w:rPr>
+        <w:t xml:space="preserve">to display </w:t>
+      </w:r>
+      <w:proofErr w:type="gramStart"/>
+      <w:r>
+        <w:rPr>
+          <w:color w:val="000000" w:themeColor="text1"/>
+          <w:sz w:val="22"/>
+          <w:szCs w:val="22"/>
+        </w:rPr>
+        <w:t>things</w:t>
+      </w:r>
+      <w:proofErr w:type="gramEnd"/>
+      <w:r>
+        <w:rPr>
+          <w:color w:val="000000" w:themeColor="text1"/>
+          <w:sz w:val="22"/>
+          <w:szCs w:val="22"/>
+        </w:rPr>
+        <w:t xml:space="preserve"> we use </w:t>
+      </w:r>
+      <w:proofErr w:type="gramStart"/>
+      <w:r>
+        <w:rPr>
+          <w:color w:val="000000" w:themeColor="text1"/>
+          <w:sz w:val="22"/>
+          <w:szCs w:val="22"/>
+        </w:rPr>
+        <w:t>the .render</w:t>
+      </w:r>
+      <w:proofErr w:type="gramEnd"/>
+      <w:r>
+        <w:rPr>
+          <w:color w:val="000000" w:themeColor="text1"/>
+          <w:sz w:val="22"/>
+          <w:szCs w:val="22"/>
+        </w:rPr>
+        <w:t xml:space="preserve">() however we </w:t>
+      </w:r>
+      <w:proofErr w:type="spellStart"/>
+      <w:proofErr w:type="gramStart"/>
+      <w:r>
+        <w:rPr>
+          <w:color w:val="000000" w:themeColor="text1"/>
+          <w:sz w:val="22"/>
+          <w:szCs w:val="22"/>
+        </w:rPr>
+        <w:t>cant</w:t>
+      </w:r>
+      <w:proofErr w:type="spellEnd"/>
+      <w:proofErr w:type="gramEnd"/>
+      <w:r>
+        <w:rPr>
+          <w:color w:val="000000" w:themeColor="text1"/>
+          <w:sz w:val="22"/>
+          <w:szCs w:val="22"/>
+        </w:rPr>
+        <w:t xml:space="preserve"> pass multiple elements inside it, what we can do is to create a div and save it into a </w:t>
+      </w:r>
+      <w:proofErr w:type="spellStart"/>
+      <w:r>
+        <w:rPr>
+          <w:color w:val="000000" w:themeColor="text1"/>
+          <w:sz w:val="22"/>
+          <w:szCs w:val="22"/>
+        </w:rPr>
+        <w:t>javascript</w:t>
+      </w:r>
+      <w:proofErr w:type="spellEnd"/>
+      <w:r>
+        <w:rPr>
+          <w:color w:val="000000" w:themeColor="text1"/>
+          <w:sz w:val="22"/>
+          <w:szCs w:val="22"/>
+        </w:rPr>
+        <w:t xml:space="preserve"> variable and this variable we pass to the render.</w:t>
+      </w:r>
+    </w:p>
+    <w:p>
+      <w:pPr>
+        <w:rPr>
+          <w:color w:val="000000" w:themeColor="text1"/>
+          <w:sz w:val="22"/>
+          <w:szCs w:val="22"/>
+        </w:rPr>
+      </w:pPr>
+    </w:p>
+    <w:p>
+      <w:pPr>
+        <w:rPr>
+          <w:color w:val="000000" w:themeColor="text1"/>
+          <w:sz w:val="22"/>
+          <w:szCs w:val="22"/>
+        </w:rPr>
+      </w:pPr>
+      <w:r>
+        <w:rPr>
+          <w:color w:val="000000" w:themeColor="text1"/>
+          <w:sz w:val="22"/>
+          <w:szCs w:val="22"/>
+        </w:rPr>
+        <w:t xml:space="preserve">when we have multiple elements in html saved to a JS constant or variable it’s the best practice to surround them with </w:t>
+      </w:r>
+      <w:proofErr w:type="gramStart"/>
+      <w:r>
+        <w:rPr>
+          <w:color w:val="000000" w:themeColor="text1"/>
+          <w:sz w:val="22"/>
+          <w:szCs w:val="22"/>
+        </w:rPr>
+        <w:t>( )</w:t>
+      </w:r>
+      <w:proofErr w:type="gramEnd"/>
+      <w:r>
+        <w:rPr>
+          <w:color w:val="000000" w:themeColor="text1"/>
+          <w:sz w:val="22"/>
+          <w:szCs w:val="22"/>
+        </w:rPr>
+        <w:t>.</w:t>
       </w:r>
     </w:p>
     <w:p>
@@ -402,41 +656,105 @@
           <w:szCs w:val="22"/>
         </w:rPr>
         <w:lastRenderedPageBreak/>
-        <w:t xml:space="preserve">in JSX its totally valid to pass a JS code inside our html for example </w:t>
-      </w:r>
-    </w:p>
-    <w:p>
-      <w:pPr>
-        <w:rPr>
-          <w:color w:val="EE0000"/>
-          <w:sz w:val="22"/>
-          <w:szCs w:val="22"/>
-        </w:rPr>
-      </w:pPr>
-      <w:r>
-        <w:rPr>
-          <w:color w:val="EE0000"/>
-          <w:sz w:val="22"/>
-          <w:szCs w:val="22"/>
-        </w:rPr>
-        <w:t>&lt;p&gt; this is a paragraph {myName}&lt;/p&gt;</w:t>
-      </w:r>
-    </w:p>
-    <w:p>
-      <w:pPr>
-        <w:rPr>
-          <w:color w:val="000000" w:themeColor="text1"/>
-          <w:sz w:val="22"/>
-          <w:szCs w:val="22"/>
-        </w:rPr>
-      </w:pPr>
-      <w:r>
-        <w:rPr>
-          <w:color w:val="000000" w:themeColor="text1"/>
-          <w:sz w:val="22"/>
-          <w:szCs w:val="22"/>
-        </w:rPr>
-        <w:t>myName is a javascript variable that could be holding any string</w:t>
+        <w:t xml:space="preserve">in JSX </w:t>
+      </w:r>
+      <w:proofErr w:type="gramStart"/>
+      <w:r>
+        <w:rPr>
+          <w:color w:val="000000" w:themeColor="text1"/>
+          <w:sz w:val="22"/>
+          <w:szCs w:val="22"/>
+        </w:rPr>
+        <w:t>its</w:t>
+      </w:r>
+      <w:proofErr w:type="gramEnd"/>
+      <w:r>
+        <w:rPr>
+          <w:color w:val="000000" w:themeColor="text1"/>
+          <w:sz w:val="22"/>
+          <w:szCs w:val="22"/>
+        </w:rPr>
+        <w:t xml:space="preserve"> totally valid to pass a JS code inside our html for example </w:t>
+      </w:r>
+    </w:p>
+    <w:p>
+      <w:pPr>
+        <w:rPr>
+          <w:color w:val="EE0000"/>
+          <w:sz w:val="22"/>
+          <w:szCs w:val="22"/>
+        </w:rPr>
+      </w:pPr>
+      <w:r>
+        <w:rPr>
+          <w:color w:val="EE0000"/>
+          <w:sz w:val="22"/>
+          <w:szCs w:val="22"/>
+        </w:rPr>
+        <w:t>&lt;p&gt; this is a paragraph {</w:t>
+      </w:r>
+      <w:proofErr w:type="spellStart"/>
+      <w:r>
+        <w:rPr>
+          <w:color w:val="EE0000"/>
+          <w:sz w:val="22"/>
+          <w:szCs w:val="22"/>
+        </w:rPr>
+        <w:t>myName</w:t>
+      </w:r>
+      <w:proofErr w:type="spellEnd"/>
+      <w:r>
+        <w:rPr>
+          <w:color w:val="EE0000"/>
+          <w:sz w:val="22"/>
+          <w:szCs w:val="22"/>
+        </w:rPr>
+        <w:t>}&lt;/p&gt;</w:t>
+      </w:r>
+    </w:p>
+    <w:p>
+      <w:pPr>
+        <w:rPr>
+          <w:color w:val="000000" w:themeColor="text1"/>
+          <w:sz w:val="22"/>
+          <w:szCs w:val="22"/>
+        </w:rPr>
+      </w:pPr>
+      <w:proofErr w:type="spellStart"/>
+      <w:r>
+        <w:rPr>
+          <w:color w:val="000000" w:themeColor="text1"/>
+          <w:sz w:val="22"/>
+          <w:szCs w:val="22"/>
+        </w:rPr>
+        <w:t>myName</w:t>
+      </w:r>
+      <w:proofErr w:type="spellEnd"/>
+      <w:r>
+        <w:rPr>
+          <w:color w:val="000000" w:themeColor="text1"/>
+          <w:sz w:val="22"/>
+          <w:szCs w:val="22"/>
+        </w:rPr>
+        <w:t xml:space="preserve"> is a </w:t>
+      </w:r>
+      <w:proofErr w:type="spellStart"/>
+      <w:r>
+        <w:rPr>
+          <w:color w:val="000000" w:themeColor="text1"/>
+          <w:sz w:val="22"/>
+          <w:szCs w:val="22"/>
+        </w:rPr>
+        <w:t>javascript</w:t>
+      </w:r>
+      <w:proofErr w:type="spellEnd"/>
+      <w:r>
+        <w:rPr>
+          <w:color w:val="000000" w:themeColor="text1"/>
+          <w:sz w:val="22"/>
+          <w:szCs w:val="22"/>
+        </w:rPr>
+        <w:t xml:space="preserve"> variable that could be holding any string</w:t>
       </w:r>
     </w:p>
     <w:p>
@@ -488,7 +806,61 @@
           <w:sz w:val="22"/>
           <w:szCs w:val="22"/>
         </w:rPr>
-        <w:t>we can create components in react by creating a js function function name (){}</w:t>
+        <w:t xml:space="preserve">we can create components in react by creating a </w:t>
+      </w:r>
+      <w:proofErr w:type="spellStart"/>
+      <w:r>
+        <w:rPr>
+          <w:color w:val="000000" w:themeColor="text1"/>
+          <w:sz w:val="22"/>
+          <w:szCs w:val="22"/>
+        </w:rPr>
+        <w:t>js</w:t>
+      </w:r>
+      <w:proofErr w:type="spellEnd"/>
+      <w:r>
+        <w:rPr>
+          <w:color w:val="000000" w:themeColor="text1"/>
+          <w:sz w:val="22"/>
+          <w:szCs w:val="22"/>
+        </w:rPr>
+        <w:t xml:space="preserve"> function </w:t>
+      </w:r>
+      <w:proofErr w:type="spellStart"/>
+      <w:r>
+        <w:rPr>
+          <w:color w:val="000000" w:themeColor="text1"/>
+          <w:sz w:val="22"/>
+          <w:szCs w:val="22"/>
+        </w:rPr>
+        <w:t>function</w:t>
+      </w:r>
+      <w:proofErr w:type="spellEnd"/>
+      <w:r>
+        <w:rPr>
+          <w:color w:val="000000" w:themeColor="text1"/>
+          <w:sz w:val="22"/>
+          <w:szCs w:val="22"/>
+        </w:rPr>
+        <w:t xml:space="preserve"> name </w:t>
+      </w:r>
+      <w:proofErr w:type="gramStart"/>
+      <w:r>
+        <w:rPr>
+          <w:color w:val="000000" w:themeColor="text1"/>
+          <w:sz w:val="22"/>
+          <w:szCs w:val="22"/>
+        </w:rPr>
+        <w:t>(){</w:t>
+      </w:r>
+      <w:proofErr w:type="gramEnd"/>
+      <w:r>
+        <w:rPr>
+          <w:color w:val="000000" w:themeColor="text1"/>
+          <w:sz w:val="22"/>
+          <w:szCs w:val="22"/>
+        </w:rPr>
+        <w:t>}</w:t>
       </w:r>
     </w:p>
     <w:p>
@@ -522,8 +894,28 @@
           <w:sz w:val="22"/>
           <w:szCs w:val="22"/>
         </w:rPr>
-        <w:t>function FirstComponent(){</w:t>
-      </w:r>
+        <w:t xml:space="preserve">function </w:t>
+      </w:r>
+      <w:proofErr w:type="spellStart"/>
+      <w:proofErr w:type="gramStart"/>
+      <w:r>
+        <w:rPr>
+          <w:color w:val="EE0000"/>
+          <w:sz w:val="22"/>
+          <w:szCs w:val="22"/>
+        </w:rPr>
+        <w:t>FirstComponent</w:t>
+      </w:r>
+      <w:proofErr w:type="spellEnd"/>
+      <w:r>
+        <w:rPr>
+          <w:color w:val="EE0000"/>
+          <w:sz w:val="22"/>
+          <w:szCs w:val="22"/>
+        </w:rPr>
+        <w:t>(){</w:t>
+      </w:r>
+      <w:proofErr w:type="gramEnd"/>
     </w:p>
     <w:p>
       <w:pPr>
@@ -540,6 +932,14 @@
           <w:szCs w:val="22"/>
         </w:rPr>
         <w:tab/>
+      </w:r>
+      <w:proofErr w:type="gramStart"/>
+      <w:r>
+        <w:rPr>
+          <w:color w:val="EE0000"/>
+          <w:sz w:val="22"/>
+          <w:szCs w:val="22"/>
+        </w:rPr>
         <w:t>return</w:t>
       </w:r>
       <w:r>
@@ -550,6 +950,7 @@
         </w:rPr>
         <w:t>(</w:t>
       </w:r>
+      <w:proofErr w:type="gramEnd"/>
     </w:p>
     <w:p>
       <w:pPr>
@@ -627,7 +1028,27 @@
           <w:sz w:val="22"/>
           <w:szCs w:val="22"/>
         </w:rPr>
-        <w:t>when we return an html element from a function we cant return multiple elements so it’s the best practice to return a div that includes multiple elements</w:t>
+        <w:t xml:space="preserve">when we return an html element from a function we </w:t>
+      </w:r>
+      <w:proofErr w:type="spellStart"/>
+      <w:proofErr w:type="gramStart"/>
+      <w:r>
+        <w:rPr>
+          <w:color w:val="000000" w:themeColor="text1"/>
+          <w:sz w:val="22"/>
+          <w:szCs w:val="22"/>
+        </w:rPr>
+        <w:t>cant</w:t>
+      </w:r>
+      <w:proofErr w:type="spellEnd"/>
+      <w:proofErr w:type="gramEnd"/>
+      <w:r>
+        <w:rPr>
+          <w:color w:val="000000" w:themeColor="text1"/>
+          <w:sz w:val="22"/>
+          <w:szCs w:val="22"/>
+        </w:rPr>
+        <w:t xml:space="preserve"> return multiple elements so it’s the best practice to return a div that includes multiple elements</w:t>
       </w:r>
     </w:p>
     <w:p>
@@ -661,7 +1082,43 @@
           <w:sz w:val="22"/>
           <w:szCs w:val="22"/>
         </w:rPr>
-        <w:t>&lt;FunctionName&gt; &lt;/FunctionName&gt;</w:t>
+        <w:t>&lt;</w:t>
+      </w:r>
+      <w:proofErr w:type="spellStart"/>
+      <w:r>
+        <w:rPr>
+          <w:color w:val="EE0000"/>
+          <w:sz w:val="22"/>
+          <w:szCs w:val="22"/>
+        </w:rPr>
+        <w:t>FunctionName</w:t>
+      </w:r>
+      <w:proofErr w:type="spellEnd"/>
+      <w:r>
+        <w:rPr>
+          <w:color w:val="EE0000"/>
+          <w:sz w:val="22"/>
+          <w:szCs w:val="22"/>
+        </w:rPr>
+        <w:t>&gt; &lt;/</w:t>
+      </w:r>
+      <w:proofErr w:type="spellStart"/>
+      <w:r>
+        <w:rPr>
+          <w:color w:val="EE0000"/>
+          <w:sz w:val="22"/>
+          <w:szCs w:val="22"/>
+        </w:rPr>
+        <w:t>FunctionName</w:t>
+      </w:r>
+      <w:proofErr w:type="spellEnd"/>
+      <w:r>
+        <w:rPr>
+          <w:color w:val="EE0000"/>
+          <w:sz w:val="22"/>
+          <w:szCs w:val="22"/>
+        </w:rPr>
+        <w:t>&gt;</w:t>
       </w:r>
     </w:p>
     <w:p>
@@ -721,8 +1178,36 @@
           <w:sz w:val="22"/>
           <w:szCs w:val="22"/>
         </w:rPr>
-        <w:t>function FunctionName (props){</w:t>
-      </w:r>
+        <w:t xml:space="preserve">function </w:t>
+      </w:r>
+      <w:proofErr w:type="spellStart"/>
+      <w:r>
+        <w:rPr>
+          <w:color w:val="EE0000"/>
+          <w:sz w:val="22"/>
+          <w:szCs w:val="22"/>
+        </w:rPr>
+        <w:t>FunctionName</w:t>
+      </w:r>
+      <w:proofErr w:type="spellEnd"/>
+      <w:r>
+        <w:rPr>
+          <w:color w:val="EE0000"/>
+          <w:sz w:val="22"/>
+          <w:szCs w:val="22"/>
+        </w:rPr>
+        <w:t xml:space="preserve"> (props</w:t>
+      </w:r>
+      <w:proofErr w:type="gramStart"/>
+      <w:r>
+        <w:rPr>
+          <w:color w:val="EE0000"/>
+          <w:sz w:val="22"/>
+          <w:szCs w:val="22"/>
+        </w:rPr>
+        <w:t>){</w:t>
+      </w:r>
+      <w:proofErr w:type="gramEnd"/>
     </w:p>
     <w:p>
       <w:pPr>
@@ -764,24 +1249,106 @@
           <w:sz w:val="22"/>
           <w:szCs w:val="22"/>
         </w:rPr>
-        <w:t>inside this props will be all the attributes for a function stored</w:t>
-      </w:r>
-    </w:p>
-    <w:p>
-      <w:pPr>
-        <w:rPr>
-          <w:color w:val="EE0000"/>
-          <w:sz w:val="22"/>
-          <w:szCs w:val="22"/>
-        </w:rPr>
-      </w:pPr>
-      <w:r>
-        <w:rPr>
-          <w:color w:val="EE0000"/>
-          <w:sz w:val="22"/>
-          <w:szCs w:val="22"/>
-        </w:rPr>
-        <w:t>for example &lt;FunctionName  message = “ ccc” /&gt;</w:t>
+        <w:t xml:space="preserve">inside </w:t>
+      </w:r>
+      <w:proofErr w:type="gramStart"/>
+      <w:r>
+        <w:rPr>
+          <w:color w:val="EE0000"/>
+          <w:sz w:val="22"/>
+          <w:szCs w:val="22"/>
+        </w:rPr>
+        <w:t>this props</w:t>
+      </w:r>
+      <w:proofErr w:type="gramEnd"/>
+      <w:r>
+        <w:rPr>
+          <w:color w:val="EE0000"/>
+          <w:sz w:val="22"/>
+          <w:szCs w:val="22"/>
+        </w:rPr>
+        <w:t xml:space="preserve"> will be all the attributes for a function stored</w:t>
+      </w:r>
+    </w:p>
+    <w:p>
+      <w:pPr>
+        <w:rPr>
+          <w:color w:val="EE0000"/>
+          <w:sz w:val="22"/>
+          <w:szCs w:val="22"/>
+        </w:rPr>
+      </w:pPr>
+      <w:r>
+        <w:rPr>
+          <w:color w:val="EE0000"/>
+          <w:sz w:val="22"/>
+          <w:szCs w:val="22"/>
+        </w:rPr>
+        <w:t xml:space="preserve">for </w:t>
+      </w:r>
+      <w:proofErr w:type="gramStart"/>
+      <w:r>
+        <w:rPr>
+          <w:color w:val="EE0000"/>
+          <w:sz w:val="22"/>
+          <w:szCs w:val="22"/>
+        </w:rPr>
+        <w:t>example</w:t>
+      </w:r>
+      <w:proofErr w:type="gramEnd"/>
+      <w:r>
+        <w:rPr>
+          <w:color w:val="EE0000"/>
+          <w:sz w:val="22"/>
+          <w:szCs w:val="22"/>
+        </w:rPr>
+        <w:t xml:space="preserve"> &lt;</w:t>
+      </w:r>
+      <w:proofErr w:type="spellStart"/>
+      <w:proofErr w:type="gramStart"/>
+      <w:r>
+        <w:rPr>
+          <w:color w:val="EE0000"/>
+          <w:sz w:val="22"/>
+          <w:szCs w:val="22"/>
+        </w:rPr>
+        <w:t>FunctionName</w:t>
+      </w:r>
+      <w:proofErr w:type="spellEnd"/>
+      <w:r>
+        <w:rPr>
+          <w:color w:val="EE0000"/>
+          <w:sz w:val="22"/>
+          <w:szCs w:val="22"/>
+        </w:rPr>
+        <w:t xml:space="preserve">  message</w:t>
+      </w:r>
+      <w:proofErr w:type="gramEnd"/>
+      <w:r>
+        <w:rPr>
+          <w:color w:val="EE0000"/>
+          <w:sz w:val="22"/>
+          <w:szCs w:val="22"/>
+        </w:rPr>
+        <w:t xml:space="preserve"> = </w:t>
+      </w:r>
+      <w:proofErr w:type="gramStart"/>
+      <w:r>
+        <w:rPr>
+          <w:color w:val="EE0000"/>
+          <w:sz w:val="22"/>
+          <w:szCs w:val="22"/>
+        </w:rPr>
+        <w:t>“ ccc</w:t>
+      </w:r>
+      <w:proofErr w:type="gramEnd"/>
+      <w:r>
+        <w:rPr>
+          <w:color w:val="EE0000"/>
+          <w:sz w:val="22"/>
+          <w:szCs w:val="22"/>
+        </w:rPr>
+        <w:t>” /&gt;</w:t>
       </w:r>
     </w:p>
     <w:p>
@@ -801,6 +1368,8 @@
         <w:lastRenderedPageBreak/>
         <w:t xml:space="preserve">this message can be accessed by just using </w:t>
       </w:r>
+      <w:proofErr w:type="spellStart"/>
+      <w:proofErr w:type="gramStart"/>
       <w:r>
         <w:rPr>
           <w:color w:val="EE0000"/>
@@ -809,6 +1378,8 @@
         </w:rPr>
         <w:t>props.message</w:t>
       </w:r>
+      <w:proofErr w:type="spellEnd"/>
+      <w:proofErr w:type="gramEnd"/>
     </w:p>
     <w:p>
       <w:pPr>
@@ -916,24 +1487,114 @@
           <w:sz w:val="22"/>
           <w:szCs w:val="22"/>
         </w:rPr>
-        <w:t>to create an array;  const arr = []</w:t>
-      </w:r>
-    </w:p>
-    <w:p>
-      <w:pPr>
-        <w:rPr>
-          <w:color w:val="000000" w:themeColor="text1"/>
-          <w:sz w:val="22"/>
-          <w:szCs w:val="22"/>
-        </w:rPr>
-      </w:pPr>
-      <w:r>
-        <w:rPr>
-          <w:color w:val="000000" w:themeColor="text1"/>
-          <w:sz w:val="22"/>
-          <w:szCs w:val="22"/>
-        </w:rPr>
-        <w:t>to make it an array of objects, const arr = [{property: , property2: }, {}]</w:t>
+        <w:t xml:space="preserve">to create an </w:t>
+      </w:r>
+      <w:proofErr w:type="gramStart"/>
+      <w:r>
+        <w:rPr>
+          <w:color w:val="000000" w:themeColor="text1"/>
+          <w:sz w:val="22"/>
+          <w:szCs w:val="22"/>
+        </w:rPr>
+        <w:t>array;  const</w:t>
+      </w:r>
+      <w:proofErr w:type="gramEnd"/>
+      <w:r>
+        <w:rPr>
+          <w:color w:val="000000" w:themeColor="text1"/>
+          <w:sz w:val="22"/>
+          <w:szCs w:val="22"/>
+        </w:rPr>
+        <w:t xml:space="preserve"> </w:t>
+      </w:r>
+      <w:proofErr w:type="spellStart"/>
+      <w:r>
+        <w:rPr>
+          <w:color w:val="000000" w:themeColor="text1"/>
+          <w:sz w:val="22"/>
+          <w:szCs w:val="22"/>
+        </w:rPr>
+        <w:t>arr</w:t>
+      </w:r>
+      <w:proofErr w:type="spellEnd"/>
+      <w:r>
+        <w:rPr>
+          <w:color w:val="000000" w:themeColor="text1"/>
+          <w:sz w:val="22"/>
+          <w:szCs w:val="22"/>
+        </w:rPr>
+        <w:t xml:space="preserve"> = []</w:t>
+      </w:r>
+    </w:p>
+    <w:p>
+      <w:pPr>
+        <w:rPr>
+          <w:color w:val="000000" w:themeColor="text1"/>
+          <w:sz w:val="22"/>
+          <w:szCs w:val="22"/>
+        </w:rPr>
+      </w:pPr>
+      <w:r>
+        <w:rPr>
+          <w:color w:val="000000" w:themeColor="text1"/>
+          <w:sz w:val="22"/>
+          <w:szCs w:val="22"/>
+        </w:rPr>
+        <w:t xml:space="preserve">to make it an array of objects, const </w:t>
+      </w:r>
+      <w:proofErr w:type="spellStart"/>
+      <w:r>
+        <w:rPr>
+          <w:color w:val="000000" w:themeColor="text1"/>
+          <w:sz w:val="22"/>
+          <w:szCs w:val="22"/>
+        </w:rPr>
+        <w:t>arr</w:t>
+      </w:r>
+      <w:proofErr w:type="spellEnd"/>
+      <w:r>
+        <w:rPr>
+          <w:color w:val="000000" w:themeColor="text1"/>
+          <w:sz w:val="22"/>
+          <w:szCs w:val="22"/>
+        </w:rPr>
+        <w:t xml:space="preserve"> = [{property</w:t>
+      </w:r>
+      <w:proofErr w:type="gramStart"/>
+      <w:r>
+        <w:rPr>
+          <w:color w:val="000000" w:themeColor="text1"/>
+          <w:sz w:val="22"/>
+          <w:szCs w:val="22"/>
+        </w:rPr>
+        <w:t>: ,</w:t>
+      </w:r>
+      <w:proofErr w:type="gramEnd"/>
+      <w:r>
+        <w:rPr>
+          <w:color w:val="000000" w:themeColor="text1"/>
+          <w:sz w:val="22"/>
+          <w:szCs w:val="22"/>
+        </w:rPr>
+        <w:t xml:space="preserve"> property2</w:t>
+      </w:r>
+      <w:proofErr w:type="gramStart"/>
+      <w:r>
+        <w:rPr>
+          <w:color w:val="000000" w:themeColor="text1"/>
+          <w:sz w:val="22"/>
+          <w:szCs w:val="22"/>
+        </w:rPr>
+        <w:t>: }</w:t>
+      </w:r>
+      <w:proofErr w:type="gramEnd"/>
+      <w:r>
+        <w:rPr>
+          <w:color w:val="000000" w:themeColor="text1"/>
+          <w:sz w:val="22"/>
+          <w:szCs w:val="22"/>
+        </w:rPr>
+        <w:t>, {}]</w:t>
       </w:r>
     </w:p>
     <w:p>
@@ -961,13 +1622,23 @@
           <w:szCs w:val="22"/>
         </w:rPr>
       </w:pPr>
-      <w:r>
-        <w:rPr>
-          <w:color w:val="000000" w:themeColor="text1"/>
-          <w:sz w:val="22"/>
-          <w:szCs w:val="22"/>
-        </w:rPr>
-        <w:t xml:space="preserve">instead we store the data into an array of objects, each object holds properties </w:t>
+      <w:proofErr w:type="gramStart"/>
+      <w:r>
+        <w:rPr>
+          <w:color w:val="000000" w:themeColor="text1"/>
+          <w:sz w:val="22"/>
+          <w:szCs w:val="22"/>
+        </w:rPr>
+        <w:t>instead</w:t>
+      </w:r>
+      <w:proofErr w:type="gramEnd"/>
+      <w:r>
+        <w:rPr>
+          <w:color w:val="000000" w:themeColor="text1"/>
+          <w:sz w:val="22"/>
+          <w:szCs w:val="22"/>
+        </w:rPr>
+        <w:t xml:space="preserve"> we store the data into an array of objects, each object holds properties </w:t>
       </w:r>
     </w:p>
     <w:p>
@@ -1010,67 +1681,163 @@
           <w:sz w:val="22"/>
           <w:szCs w:val="22"/>
         </w:rPr>
-        <w:t>we then should take the array, arr.map()</w:t>
-      </w:r>
-    </w:p>
-    <w:p>
-      <w:pPr>
-        <w:rPr>
-          <w:color w:val="000000" w:themeColor="text1"/>
-          <w:sz w:val="22"/>
-          <w:szCs w:val="22"/>
-        </w:rPr>
-      </w:pPr>
-      <w:r>
-        <w:rPr>
-          <w:color w:val="000000" w:themeColor="text1"/>
-          <w:sz w:val="22"/>
-          <w:szCs w:val="22"/>
-        </w:rPr>
-        <w:t>the .map() lets us iterate through each value within the array</w:t>
-      </w:r>
-    </w:p>
-    <w:p>
-      <w:pPr>
-        <w:rPr>
-          <w:color w:val="000000" w:themeColor="text1"/>
-          <w:sz w:val="22"/>
-          <w:szCs w:val="22"/>
-        </w:rPr>
-      </w:pPr>
-      <w:r>
-        <w:rPr>
-          <w:color w:val="000000" w:themeColor="text1"/>
-          <w:sz w:val="22"/>
-          <w:szCs w:val="22"/>
-        </w:rPr>
-        <w:t>arr.map ( (newVariable) =&gt; )</w:t>
-      </w:r>
-    </w:p>
-    <w:p>
-      <w:pPr>
-        <w:rPr>
-          <w:color w:val="000000" w:themeColor="text1"/>
-          <w:sz w:val="22"/>
-          <w:szCs w:val="22"/>
-        </w:rPr>
-      </w:pPr>
-    </w:p>
-    <w:p>
-      <w:pPr>
-        <w:rPr>
-          <w:color w:val="000000" w:themeColor="text1"/>
-          <w:sz w:val="22"/>
-          <w:szCs w:val="22"/>
-        </w:rPr>
-      </w:pPr>
-      <w:r>
-        <w:rPr>
-          <w:color w:val="000000" w:themeColor="text1"/>
-          <w:sz w:val="22"/>
-          <w:szCs w:val="22"/>
-        </w:rPr>
-        <w:t xml:space="preserve">.map() runs through each object inside the array and runs it against the function that we are going to pass to it, </w:t>
+        <w:t xml:space="preserve">we then should take the array, </w:t>
+      </w:r>
+      <w:proofErr w:type="spellStart"/>
+      <w:proofErr w:type="gramStart"/>
+      <w:r>
+        <w:rPr>
+          <w:color w:val="000000" w:themeColor="text1"/>
+          <w:sz w:val="22"/>
+          <w:szCs w:val="22"/>
+        </w:rPr>
+        <w:t>arr.map</w:t>
+      </w:r>
+      <w:proofErr w:type="spellEnd"/>
+      <w:r>
+        <w:rPr>
+          <w:color w:val="000000" w:themeColor="text1"/>
+          <w:sz w:val="22"/>
+          <w:szCs w:val="22"/>
+        </w:rPr>
+        <w:t>(</w:t>
+      </w:r>
+      <w:proofErr w:type="gramEnd"/>
+      <w:r>
+        <w:rPr>
+          <w:color w:val="000000" w:themeColor="text1"/>
+          <w:sz w:val="22"/>
+          <w:szCs w:val="22"/>
+        </w:rPr>
+        <w:t>)</w:t>
+      </w:r>
+    </w:p>
+    <w:p>
+      <w:pPr>
+        <w:rPr>
+          <w:color w:val="000000" w:themeColor="text1"/>
+          <w:sz w:val="22"/>
+          <w:szCs w:val="22"/>
+        </w:rPr>
+      </w:pPr>
+      <w:proofErr w:type="gramStart"/>
+      <w:r>
+        <w:rPr>
+          <w:color w:val="000000" w:themeColor="text1"/>
+          <w:sz w:val="22"/>
+          <w:szCs w:val="22"/>
+        </w:rPr>
+        <w:t>the .map</w:t>
+      </w:r>
+      <w:proofErr w:type="gramEnd"/>
+      <w:r>
+        <w:rPr>
+          <w:color w:val="000000" w:themeColor="text1"/>
+          <w:sz w:val="22"/>
+          <w:szCs w:val="22"/>
+        </w:rPr>
+        <w:t>() lets us iterate through each value within the array</w:t>
+      </w:r>
+    </w:p>
+    <w:p>
+      <w:pPr>
+        <w:rPr>
+          <w:color w:val="000000" w:themeColor="text1"/>
+          <w:sz w:val="22"/>
+          <w:szCs w:val="22"/>
+        </w:rPr>
+      </w:pPr>
+      <w:proofErr w:type="spellStart"/>
+      <w:r>
+        <w:rPr>
+          <w:color w:val="000000" w:themeColor="text1"/>
+          <w:sz w:val="22"/>
+          <w:szCs w:val="22"/>
+        </w:rPr>
+        <w:t>arr.map</w:t>
+      </w:r>
+      <w:proofErr w:type="spellEnd"/>
+      <w:r>
+        <w:rPr>
+          <w:color w:val="000000" w:themeColor="text1"/>
+          <w:sz w:val="22"/>
+          <w:szCs w:val="22"/>
+        </w:rPr>
+        <w:t xml:space="preserve"> </w:t>
+      </w:r>
+      <w:proofErr w:type="gramStart"/>
+      <w:r>
+        <w:rPr>
+          <w:color w:val="000000" w:themeColor="text1"/>
+          <w:sz w:val="22"/>
+          <w:szCs w:val="22"/>
+        </w:rPr>
+        <w:t>( (</w:t>
+      </w:r>
+      <w:proofErr w:type="spellStart"/>
+      <w:proofErr w:type="gramEnd"/>
+      <w:r>
+        <w:rPr>
+          <w:color w:val="000000" w:themeColor="text1"/>
+          <w:sz w:val="22"/>
+          <w:szCs w:val="22"/>
+        </w:rPr>
+        <w:t>newVariable</w:t>
+      </w:r>
+      <w:proofErr w:type="spellEnd"/>
+      <w:r>
+        <w:rPr>
+          <w:color w:val="000000" w:themeColor="text1"/>
+          <w:sz w:val="22"/>
+          <w:szCs w:val="22"/>
+        </w:rPr>
+        <w:t>) =</w:t>
+      </w:r>
+      <w:proofErr w:type="gramStart"/>
+      <w:r>
+        <w:rPr>
+          <w:color w:val="000000" w:themeColor="text1"/>
+          <w:sz w:val="22"/>
+          <w:szCs w:val="22"/>
+        </w:rPr>
+        <w:t>&gt; )</w:t>
+      </w:r>
+      <w:proofErr w:type="gramEnd"/>
+    </w:p>
+    <w:p>
+      <w:pPr>
+        <w:rPr>
+          <w:color w:val="000000" w:themeColor="text1"/>
+          <w:sz w:val="22"/>
+          <w:szCs w:val="22"/>
+        </w:rPr>
+      </w:pPr>
+    </w:p>
+    <w:p>
+      <w:pPr>
+        <w:rPr>
+          <w:color w:val="000000" w:themeColor="text1"/>
+          <w:sz w:val="22"/>
+          <w:szCs w:val="22"/>
+        </w:rPr>
+      </w:pPr>
+      <w:proofErr w:type="gramStart"/>
+      <w:r>
+        <w:rPr>
+          <w:color w:val="000000" w:themeColor="text1"/>
+          <w:sz w:val="22"/>
+          <w:szCs w:val="22"/>
+        </w:rPr>
+        <w:t>.map</w:t>
+      </w:r>
+      <w:proofErr w:type="gramEnd"/>
+      <w:r>
+        <w:rPr>
+          <w:color w:val="000000" w:themeColor="text1"/>
+          <w:sz w:val="22"/>
+          <w:szCs w:val="22"/>
+        </w:rPr>
+        <w:t xml:space="preserve">() runs through each object inside the array and runs it against the function that we are going to pass to it, </w:t>
       </w:r>
     </w:p>
     <w:p>
@@ -1095,8 +1862,18 @@
           <w:sz w:val="22"/>
           <w:szCs w:val="22"/>
         </w:rPr>
-        <w:t>variable we created inside the mapping funcition</w:t>
-      </w:r>
+        <w:t xml:space="preserve">variable we created inside the mapping </w:t>
+      </w:r>
+      <w:proofErr w:type="spellStart"/>
+      <w:r>
+        <w:rPr>
+          <w:color w:val="000000" w:themeColor="text1"/>
+          <w:sz w:val="22"/>
+          <w:szCs w:val="22"/>
+        </w:rPr>
+        <w:t>funcition</w:t>
+      </w:r>
+      <w:proofErr w:type="spellEnd"/>
     </w:p>
     <w:p>
       <w:pPr>
@@ -1132,13 +1909,41 @@
           <w:szCs w:val="22"/>
         </w:rPr>
       </w:pPr>
-      <w:r>
-        <w:rPr>
-          <w:color w:val="EE0000"/>
-          <w:sz w:val="22"/>
-          <w:szCs w:val="22"/>
-        </w:rPr>
-        <w:t>chatMessages.map((chatMessage) =&gt; {</w:t>
+      <w:proofErr w:type="spellStart"/>
+      <w:r>
+        <w:rPr>
+          <w:color w:val="EE0000"/>
+          <w:sz w:val="22"/>
+          <w:szCs w:val="22"/>
+        </w:rPr>
+        <w:t>chatMessages.map</w:t>
+      </w:r>
+      <w:proofErr w:type="spellEnd"/>
+      <w:r>
+        <w:rPr>
+          <w:color w:val="EE0000"/>
+          <w:sz w:val="22"/>
+          <w:szCs w:val="22"/>
+        </w:rPr>
+        <w:t>((</w:t>
+      </w:r>
+      <w:proofErr w:type="spellStart"/>
+      <w:r>
+        <w:rPr>
+          <w:color w:val="EE0000"/>
+          <w:sz w:val="22"/>
+          <w:szCs w:val="22"/>
+        </w:rPr>
+        <w:t>chatMessage</w:t>
+      </w:r>
+      <w:proofErr w:type="spellEnd"/>
+      <w:r>
+        <w:rPr>
+          <w:color w:val="EE0000"/>
+          <w:sz w:val="22"/>
+          <w:szCs w:val="22"/>
+        </w:rPr>
+        <w:t>) =&gt; {</w:t>
       </w:r>
       <w:r>
         <w:rPr>
@@ -1156,7 +1961,81 @@
           <w:szCs w:val="22"/>
         </w:rPr>
         <w:br/>
-        <w:t xml:space="preserve">          &lt;ChatMessage message={chatMessage.message} sender={chatMessage.sender} /&gt;</w:t>
+        <w:t xml:space="preserve">          &lt;</w:t>
+      </w:r>
+      <w:proofErr w:type="spellStart"/>
+      <w:r>
+        <w:rPr>
+          <w:color w:val="EE0000"/>
+          <w:sz w:val="22"/>
+          <w:szCs w:val="22"/>
+        </w:rPr>
+        <w:t>ChatMessage</w:t>
+      </w:r>
+      <w:proofErr w:type="spellEnd"/>
+      <w:r>
+        <w:rPr>
+          <w:color w:val="EE0000"/>
+          <w:sz w:val="22"/>
+          <w:szCs w:val="22"/>
+        </w:rPr>
+        <w:t xml:space="preserve"> message</w:t>
+      </w:r>
+      <w:proofErr w:type="gramStart"/>
+      <w:r>
+        <w:rPr>
+          <w:color w:val="EE0000"/>
+          <w:sz w:val="22"/>
+          <w:szCs w:val="22"/>
+        </w:rPr>
+        <w:t>={</w:t>
+      </w:r>
+      <w:proofErr w:type="spellStart"/>
+      <w:proofErr w:type="gramEnd"/>
+      <w:r>
+        <w:rPr>
+          <w:color w:val="EE0000"/>
+          <w:sz w:val="22"/>
+          <w:szCs w:val="22"/>
+        </w:rPr>
+        <w:t>chatMessage.message</w:t>
+      </w:r>
+      <w:proofErr w:type="spellEnd"/>
+      <w:r>
+        <w:rPr>
+          <w:color w:val="EE0000"/>
+          <w:sz w:val="22"/>
+          <w:szCs w:val="22"/>
+        </w:rPr>
+        <w:t>} sender</w:t>
+      </w:r>
+      <w:proofErr w:type="gramStart"/>
+      <w:r>
+        <w:rPr>
+          <w:color w:val="EE0000"/>
+          <w:sz w:val="22"/>
+          <w:szCs w:val="22"/>
+        </w:rPr>
+        <w:t>={</w:t>
+      </w:r>
+      <w:proofErr w:type="spellStart"/>
+      <w:proofErr w:type="gramEnd"/>
+      <w:r>
+        <w:rPr>
+          <w:color w:val="EE0000"/>
+          <w:sz w:val="22"/>
+          <w:szCs w:val="22"/>
+        </w:rPr>
+        <w:t>chatMessage.sender</w:t>
+      </w:r>
+      <w:proofErr w:type="spellEnd"/>
+      <w:r>
+        <w:rPr>
+          <w:color w:val="EE0000"/>
+          <w:sz w:val="22"/>
+          <w:szCs w:val="22"/>
+        </w:rPr>
+        <w:t>} /&gt;</w:t>
       </w:r>
       <w:r>
         <w:rPr>
@@ -1194,6 +2073,7 @@
         <w:lastRenderedPageBreak/>
         <w:t xml:space="preserve">explaining the behavior, we first created an array of objects called </w:t>
       </w:r>
+      <w:proofErr w:type="spellStart"/>
       <w:r>
         <w:rPr>
           <w:b/>
@@ -1204,6 +2084,7 @@
         </w:rPr>
         <w:t>chatMessages</w:t>
       </w:r>
+      <w:proofErr w:type="spellEnd"/>
       <w:r>
         <w:rPr>
           <w:color w:val="000000" w:themeColor="text1"/>
@@ -1246,8 +2127,27 @@
           <w:sz w:val="22"/>
           <w:szCs w:val="22"/>
         </w:rPr>
-        <w:t xml:space="preserve">() takes a function inside, inside that function we created a new variable to hold each object when we iterate throught the </w:t>
-      </w:r>
+        <w:t xml:space="preserve">() takes a function inside, inside that function we created a new variable to hold each object when we iterate </w:t>
+      </w:r>
+      <w:proofErr w:type="spellStart"/>
+      <w:r>
+        <w:rPr>
+          <w:color w:val="000000" w:themeColor="text1"/>
+          <w:sz w:val="22"/>
+          <w:szCs w:val="22"/>
+        </w:rPr>
+        <w:t>throught</w:t>
+      </w:r>
+      <w:proofErr w:type="spellEnd"/>
+      <w:r>
+        <w:rPr>
+          <w:color w:val="000000" w:themeColor="text1"/>
+          <w:sz w:val="22"/>
+          <w:szCs w:val="22"/>
+        </w:rPr>
+        <w:t xml:space="preserve"> the </w:t>
+      </w:r>
+      <w:proofErr w:type="spellStart"/>
       <w:r>
         <w:rPr>
           <w:b/>
@@ -1256,16 +2156,9 @@
           <w:sz w:val="22"/>
           <w:szCs w:val="22"/>
         </w:rPr>
-        <w:t xml:space="preserve">chatMessages </w:t>
-      </w:r>
-      <w:r>
-        <w:rPr>
-          <w:color w:val="000000" w:themeColor="text1"/>
-          <w:sz w:val="22"/>
-          <w:szCs w:val="22"/>
-        </w:rPr>
-        <w:t xml:space="preserve">the function then returns a component of </w:t>
-      </w:r>
+        <w:t>chatMessages</w:t>
+      </w:r>
+      <w:proofErr w:type="spellEnd"/>
       <w:r>
         <w:rPr>
           <w:b/>
@@ -1274,59 +2167,17 @@
           <w:sz w:val="22"/>
           <w:szCs w:val="22"/>
         </w:rPr>
-        <w:t xml:space="preserve">ChatMessage </w:t>
-      </w:r>
-      <w:r>
-        <w:rPr>
-          <w:color w:val="000000" w:themeColor="text1"/>
-          <w:sz w:val="22"/>
-          <w:szCs w:val="22"/>
-        </w:rPr>
-        <w:t>this component stores the message from the iteration and the sender.</w:t>
-      </w:r>
-    </w:p>
-    <w:p>
-      <w:pPr>
-        <w:rPr>
-          <w:color w:val="000000" w:themeColor="text1"/>
-          <w:sz w:val="22"/>
-          <w:szCs w:val="22"/>
-        </w:rPr>
-      </w:pPr>
-    </w:p>
-    <w:p>
-      <w:pPr>
-        <w:rPr>
-          <w:color w:val="000000" w:themeColor="text1"/>
-          <w:sz w:val="22"/>
-          <w:szCs w:val="22"/>
-        </w:rPr>
-      </w:pPr>
-      <w:r>
-        <w:rPr>
-          <w:color w:val="000000" w:themeColor="text1"/>
-          <w:sz w:val="22"/>
-          <w:szCs w:val="22"/>
-        </w:rPr>
-        <w:t>in our Js we can insert a code like the mapping code directly into our JSX {}</w:t>
-      </w:r>
-    </w:p>
-    <w:p>
-      <w:pPr>
-        <w:rPr>
-          <w:color w:val="000000" w:themeColor="text1"/>
-          <w:sz w:val="22"/>
-          <w:szCs w:val="22"/>
-        </w:rPr>
-      </w:pPr>
-      <w:r>
-        <w:rPr>
-          <w:color w:val="000000" w:themeColor="text1"/>
-          <w:sz w:val="22"/>
-          <w:szCs w:val="22"/>
-        </w:rPr>
-        <w:t>In React, the </w:t>
-      </w:r>
+        <w:t xml:space="preserve"> </w:t>
+      </w:r>
+      <w:r>
+        <w:rPr>
+          <w:color w:val="000000" w:themeColor="text1"/>
+          <w:sz w:val="22"/>
+          <w:szCs w:val="22"/>
+        </w:rPr>
+        <w:t xml:space="preserve">the function then returns a component of </w:t>
+      </w:r>
+      <w:proofErr w:type="spellStart"/>
       <w:r>
         <w:rPr>
           <w:b/>
@@ -1335,137 +2186,105 @@
           <w:sz w:val="22"/>
           <w:szCs w:val="22"/>
         </w:rPr>
-        <w:t>key</w:t>
-      </w:r>
-      <w:r>
-        <w:rPr>
-          <w:color w:val="000000" w:themeColor="text1"/>
-          <w:sz w:val="22"/>
-          <w:szCs w:val="22"/>
-        </w:rPr>
-        <w:t> prop is essential when rendering lists because it helps React efficiently identify which items have changed, been added, or removed. Without a unique key (like an id from your data), React would have to re-render the entire list every time something changes, which hurts performance and can cause bugs with component state. When you provide a stable, unique key (never use the array index unless the list never changes), React can quickly match elements between renders and only update what's necessary. Think of key as a nametag for each item in your list—it allows React to tell each item apart, keep track of them correctly, and avoid mixing them up when your data updates.</w:t>
-      </w:r>
-    </w:p>
-    <w:p>
-      <w:pPr>
-        <w:rPr>
-          <w:color w:val="000000" w:themeColor="text1"/>
-          <w:sz w:val="22"/>
-          <w:szCs w:val="22"/>
-        </w:rPr>
-      </w:pPr>
-    </w:p>
-    <w:p>
-      <w:pPr>
+        <w:t>ChatMessage</w:t>
+      </w:r>
+      <w:proofErr w:type="spellEnd"/>
+      <w:r>
         <w:rPr>
           <w:b/>
           <w:bCs/>
           <w:color w:val="000000" w:themeColor="text1"/>
-          <w:u w:val="single"/>
-        </w:rPr>
-      </w:pPr>
+          <w:sz w:val="22"/>
+          <w:szCs w:val="22"/>
+        </w:rPr>
+        <w:t xml:space="preserve"> </w:t>
+      </w:r>
+      <w:r>
+        <w:rPr>
+          <w:color w:val="000000" w:themeColor="text1"/>
+          <w:sz w:val="22"/>
+          <w:szCs w:val="22"/>
+        </w:rPr>
+        <w:t>this component stores the message from the iteration and the sender.</w:t>
+      </w:r>
+    </w:p>
+    <w:p>
+      <w:pPr>
+        <w:rPr>
+          <w:color w:val="000000" w:themeColor="text1"/>
+          <w:sz w:val="22"/>
+          <w:szCs w:val="22"/>
+        </w:rPr>
+      </w:pPr>
+    </w:p>
+    <w:p>
+      <w:pPr>
+        <w:rPr>
+          <w:color w:val="000000" w:themeColor="text1"/>
+          <w:sz w:val="22"/>
+          <w:szCs w:val="22"/>
+        </w:rPr>
+      </w:pPr>
+      <w:r>
+        <w:rPr>
+          <w:color w:val="000000" w:themeColor="text1"/>
+          <w:sz w:val="22"/>
+          <w:szCs w:val="22"/>
+        </w:rPr>
+        <w:t xml:space="preserve">in our </w:t>
+      </w:r>
+      <w:proofErr w:type="spellStart"/>
+      <w:r>
+        <w:rPr>
+          <w:color w:val="000000" w:themeColor="text1"/>
+          <w:sz w:val="22"/>
+          <w:szCs w:val="22"/>
+        </w:rPr>
+        <w:t>Js</w:t>
+      </w:r>
+      <w:proofErr w:type="spellEnd"/>
+      <w:r>
+        <w:rPr>
+          <w:color w:val="000000" w:themeColor="text1"/>
+          <w:sz w:val="22"/>
+          <w:szCs w:val="22"/>
+        </w:rPr>
+        <w:t xml:space="preserve"> we can insert a code like the mapping code directly into our JSX {}</w:t>
+      </w:r>
+    </w:p>
+    <w:p>
+      <w:pPr>
+        <w:rPr>
+          <w:color w:val="000000" w:themeColor="text1"/>
+          <w:sz w:val="22"/>
+          <w:szCs w:val="22"/>
+        </w:rPr>
+      </w:pPr>
+      <w:r>
+        <w:rPr>
+          <w:color w:val="000000" w:themeColor="text1"/>
+          <w:sz w:val="22"/>
+          <w:szCs w:val="22"/>
+        </w:rPr>
+        <w:t>In React, the </w:t>
+      </w:r>
       <w:r>
         <w:rPr>
           <w:b/>
           <w:bCs/>
           <w:color w:val="000000" w:themeColor="text1"/>
-          <w:u w:val="single"/>
-        </w:rPr>
-        <w:t>Event handlers:</w:t>
-      </w:r>
-    </w:p>
-    <w:p>
-      <w:pPr>
-        <w:rPr>
-          <w:color w:val="000000" w:themeColor="text1"/>
-          <w:sz w:val="22"/>
-          <w:szCs w:val="22"/>
-        </w:rPr>
-      </w:pPr>
-      <w:r>
-        <w:rPr>
-          <w:color w:val="000000" w:themeColor="text1"/>
-          <w:sz w:val="22"/>
-          <w:szCs w:val="22"/>
-        </w:rPr>
-        <w:t>lets us run an function when we interact with the website</w:t>
-      </w:r>
-    </w:p>
-    <w:p>
-      <w:pPr>
-        <w:rPr>
-          <w:color w:val="000000" w:themeColor="text1"/>
-          <w:sz w:val="22"/>
-          <w:szCs w:val="22"/>
-        </w:rPr>
-      </w:pPr>
-      <w:r>
-        <w:rPr>
-          <w:color w:val="000000" w:themeColor="text1"/>
-          <w:sz w:val="22"/>
-          <w:szCs w:val="22"/>
-        </w:rPr>
-        <w:t>{} lets us save any value in a function including a function</w:t>
-      </w:r>
-    </w:p>
-    <w:p>
-      <w:pPr>
-        <w:rPr>
-          <w:color w:val="000000" w:themeColor="text1"/>
-          <w:sz w:val="22"/>
-          <w:szCs w:val="22"/>
-        </w:rPr>
-      </w:pPr>
-      <w:r>
-        <w:rPr>
-          <w:color w:val="000000" w:themeColor="text1"/>
-          <w:sz w:val="22"/>
-          <w:szCs w:val="22"/>
-        </w:rPr>
-        <w:t>&lt;button onClick={executefunction()}&gt; &lt;/button&gt;</w:t>
-      </w:r>
-    </w:p>
-    <w:p>
-      <w:pPr>
-        <w:rPr>
-          <w:color w:val="000000" w:themeColor="text1"/>
-          <w:sz w:val="22"/>
-          <w:szCs w:val="22"/>
-        </w:rPr>
-      </w:pPr>
-    </w:p>
-    <w:p>
-      <w:pPr>
-        <w:rPr>
-          <w:color w:val="EE0000"/>
-          <w:sz w:val="22"/>
-          <w:szCs w:val="22"/>
-        </w:rPr>
-      </w:pPr>
-      <w:r>
-        <w:rPr>
-          <w:color w:val="EE0000"/>
-          <w:sz w:val="22"/>
-          <w:szCs w:val="22"/>
-        </w:rPr>
-        <w:t>&lt;button onClick={sendMessage}&gt;Send Message&lt;/button&gt;</w:t>
-      </w:r>
-    </w:p>
-    <w:p>
-      <w:pPr>
-        <w:rPr>
-          <w:color w:val="000000" w:themeColor="text1"/>
-          <w:sz w:val="22"/>
-          <w:szCs w:val="22"/>
-        </w:rPr>
-      </w:pPr>
-      <w:r>
-        <w:rPr>
-          <w:color w:val="000000" w:themeColor="text1"/>
-          <w:sz w:val="22"/>
-          <w:szCs w:val="22"/>
-        </w:rPr>
-        <w:t>onClick is the event, {sendMessage} is the event handler.</w:t>
+          <w:sz w:val="22"/>
+          <w:szCs w:val="22"/>
+        </w:rPr>
+        <w:t>key</w:t>
+      </w:r>
+      <w:r>
+        <w:rPr>
+          <w:color w:val="000000" w:themeColor="text1"/>
+          <w:sz w:val="22"/>
+          <w:szCs w:val="22"/>
+        </w:rPr>
+        <w:t> prop is essential when rendering lists because it helps React efficiently identify which items have changed, been added, or removed. Without a unique key (like an id from your data), React would have to re-render the entire list every time something changes, which hurts performance and can cause bugs with component state. When you provide a stable, unique key (never use the array index unless the list never changes), React can quickly match elements between renders and only update what's necessary. Think of key as a nametag for each item in your list—it allows React to tell each item apart, keep track of them correctly, and avoid mixing them up when your data updates.</w:t>
       </w:r>
     </w:p>
     <w:p>
@@ -1493,75 +2312,241 @@
           <w:color w:val="000000" w:themeColor="text1"/>
           <w:u w:val="single"/>
         </w:rPr>
-        <w:t>State:</w:t>
-      </w:r>
-    </w:p>
-    <w:p>
-      <w:pPr>
-        <w:rPr>
-          <w:color w:val="000000" w:themeColor="text1"/>
-          <w:sz w:val="22"/>
-          <w:szCs w:val="22"/>
-        </w:rPr>
-      </w:pPr>
-      <w:r>
-        <w:rPr>
-          <w:color w:val="000000" w:themeColor="text1"/>
-          <w:sz w:val="22"/>
-          <w:szCs w:val="22"/>
-        </w:rPr>
-        <w:t xml:space="preserve">state is data that is connected to the html, in our code we have a normal const chatmessages array of objects, when we update it, it does not show the new array after being updated, to fix this we need to convert it into a state. </w:t>
-      </w:r>
-    </w:p>
-    <w:p>
-      <w:pPr>
-        <w:rPr>
-          <w:color w:val="000000" w:themeColor="text1"/>
-          <w:sz w:val="22"/>
-          <w:szCs w:val="22"/>
-        </w:rPr>
-      </w:pPr>
-      <w:r>
-        <w:rPr>
-          <w:color w:val="000000" w:themeColor="text1"/>
-          <w:sz w:val="22"/>
-          <w:szCs w:val="22"/>
-        </w:rPr>
-        <w:t>React.useState( here lives the array of objeccts);</w:t>
-      </w:r>
-    </w:p>
-    <w:p>
-      <w:pPr>
-        <w:rPr>
-          <w:color w:val="000000" w:themeColor="text1"/>
-          <w:sz w:val="22"/>
-          <w:szCs w:val="22"/>
-        </w:rPr>
-      </w:pPr>
-      <w:r>
-        <w:rPr>
-          <w:color w:val="000000" w:themeColor="text1"/>
-          <w:sz w:val="22"/>
-          <w:szCs w:val="22"/>
-        </w:rPr>
-        <w:t>then we should save that array into a variable to use it</w:t>
-      </w:r>
-    </w:p>
-    <w:p>
-      <w:pPr>
-        <w:rPr>
-          <w:color w:val="000000" w:themeColor="text1"/>
-          <w:sz w:val="22"/>
-          <w:szCs w:val="22"/>
-        </w:rPr>
-      </w:pPr>
-      <w:r>
-        <w:rPr>
-          <w:color w:val="000000" w:themeColor="text1"/>
-          <w:sz w:val="22"/>
-          <w:szCs w:val="22"/>
-        </w:rPr>
-        <w:t>arrayName[0] this will always get us the first message (latest)</w:t>
+        <w:t>Event handlers:</w:t>
+      </w:r>
+    </w:p>
+    <w:p>
+      <w:pPr>
+        <w:rPr>
+          <w:color w:val="000000" w:themeColor="text1"/>
+          <w:sz w:val="22"/>
+          <w:szCs w:val="22"/>
+        </w:rPr>
+      </w:pPr>
+      <w:proofErr w:type="spellStart"/>
+      <w:proofErr w:type="gramStart"/>
+      <w:r>
+        <w:rPr>
+          <w:color w:val="000000" w:themeColor="text1"/>
+          <w:sz w:val="22"/>
+          <w:szCs w:val="22"/>
+        </w:rPr>
+        <w:t>lets</w:t>
+      </w:r>
+      <w:proofErr w:type="spellEnd"/>
+      <w:proofErr w:type="gramEnd"/>
+      <w:r>
+        <w:rPr>
+          <w:color w:val="000000" w:themeColor="text1"/>
+          <w:sz w:val="22"/>
+          <w:szCs w:val="22"/>
+        </w:rPr>
+        <w:t xml:space="preserve"> us run </w:t>
+      </w:r>
+      <w:proofErr w:type="gramStart"/>
+      <w:r>
+        <w:rPr>
+          <w:color w:val="000000" w:themeColor="text1"/>
+          <w:sz w:val="22"/>
+          <w:szCs w:val="22"/>
+        </w:rPr>
+        <w:t>an</w:t>
+      </w:r>
+      <w:proofErr w:type="gramEnd"/>
+      <w:r>
+        <w:rPr>
+          <w:color w:val="000000" w:themeColor="text1"/>
+          <w:sz w:val="22"/>
+          <w:szCs w:val="22"/>
+        </w:rPr>
+        <w:t xml:space="preserve"> function when we interact with the website</w:t>
+      </w:r>
+    </w:p>
+    <w:p>
+      <w:pPr>
+        <w:rPr>
+          <w:color w:val="000000" w:themeColor="text1"/>
+          <w:sz w:val="22"/>
+          <w:szCs w:val="22"/>
+        </w:rPr>
+      </w:pPr>
+      <w:r>
+        <w:rPr>
+          <w:color w:val="000000" w:themeColor="text1"/>
+          <w:sz w:val="22"/>
+          <w:szCs w:val="22"/>
+        </w:rPr>
+        <w:t>{} lets us save any value in a function including a function</w:t>
+      </w:r>
+    </w:p>
+    <w:p>
+      <w:pPr>
+        <w:rPr>
+          <w:color w:val="000000" w:themeColor="text1"/>
+          <w:sz w:val="22"/>
+          <w:szCs w:val="22"/>
+        </w:rPr>
+      </w:pPr>
+      <w:r>
+        <w:rPr>
+          <w:color w:val="000000" w:themeColor="text1"/>
+          <w:sz w:val="22"/>
+          <w:szCs w:val="22"/>
+        </w:rPr>
+        <w:t xml:space="preserve">&lt;button </w:t>
+      </w:r>
+      <w:proofErr w:type="spellStart"/>
+      <w:r>
+        <w:rPr>
+          <w:color w:val="000000" w:themeColor="text1"/>
+          <w:sz w:val="22"/>
+          <w:szCs w:val="22"/>
+        </w:rPr>
+        <w:t>onClick</w:t>
+      </w:r>
+      <w:proofErr w:type="spellEnd"/>
+      <w:r>
+        <w:rPr>
+          <w:color w:val="000000" w:themeColor="text1"/>
+          <w:sz w:val="22"/>
+          <w:szCs w:val="22"/>
+        </w:rPr>
+        <w:t>={</w:t>
+      </w:r>
+      <w:proofErr w:type="spellStart"/>
+      <w:proofErr w:type="gramStart"/>
+      <w:r>
+        <w:rPr>
+          <w:color w:val="000000" w:themeColor="text1"/>
+          <w:sz w:val="22"/>
+          <w:szCs w:val="22"/>
+        </w:rPr>
+        <w:t>executefunction</w:t>
+      </w:r>
+      <w:proofErr w:type="spellEnd"/>
+      <w:r>
+        <w:rPr>
+          <w:color w:val="000000" w:themeColor="text1"/>
+          <w:sz w:val="22"/>
+          <w:szCs w:val="22"/>
+        </w:rPr>
+        <w:t>(</w:t>
+      </w:r>
+      <w:proofErr w:type="gramEnd"/>
+      <w:r>
+        <w:rPr>
+          <w:color w:val="000000" w:themeColor="text1"/>
+          <w:sz w:val="22"/>
+          <w:szCs w:val="22"/>
+        </w:rPr>
+        <w:t>)}&gt; &lt;/button&gt;</w:t>
+      </w:r>
+    </w:p>
+    <w:p>
+      <w:pPr>
+        <w:rPr>
+          <w:color w:val="000000" w:themeColor="text1"/>
+          <w:sz w:val="22"/>
+          <w:szCs w:val="22"/>
+        </w:rPr>
+      </w:pPr>
+    </w:p>
+    <w:p>
+      <w:pPr>
+        <w:rPr>
+          <w:color w:val="EE0000"/>
+          <w:sz w:val="22"/>
+          <w:szCs w:val="22"/>
+        </w:rPr>
+      </w:pPr>
+      <w:r>
+        <w:rPr>
+          <w:color w:val="EE0000"/>
+          <w:sz w:val="22"/>
+          <w:szCs w:val="22"/>
+        </w:rPr>
+        <w:t xml:space="preserve">&lt;button </w:t>
+      </w:r>
+      <w:proofErr w:type="spellStart"/>
+      <w:r>
+        <w:rPr>
+          <w:color w:val="EE0000"/>
+          <w:sz w:val="22"/>
+          <w:szCs w:val="22"/>
+        </w:rPr>
+        <w:t>onClick</w:t>
+      </w:r>
+      <w:proofErr w:type="spellEnd"/>
+      <w:r>
+        <w:rPr>
+          <w:color w:val="EE0000"/>
+          <w:sz w:val="22"/>
+          <w:szCs w:val="22"/>
+        </w:rPr>
+        <w:t>={</w:t>
+      </w:r>
+      <w:proofErr w:type="spellStart"/>
+      <w:r>
+        <w:rPr>
+          <w:color w:val="EE0000"/>
+          <w:sz w:val="22"/>
+          <w:szCs w:val="22"/>
+        </w:rPr>
+        <w:t>sendMessage</w:t>
+      </w:r>
+      <w:proofErr w:type="spellEnd"/>
+      <w:r>
+        <w:rPr>
+          <w:color w:val="EE0000"/>
+          <w:sz w:val="22"/>
+          <w:szCs w:val="22"/>
+        </w:rPr>
+        <w:t>}&gt;Send Message&lt;/button&gt;</w:t>
+      </w:r>
+    </w:p>
+    <w:p>
+      <w:pPr>
+        <w:rPr>
+          <w:color w:val="000000" w:themeColor="text1"/>
+          <w:sz w:val="22"/>
+          <w:szCs w:val="22"/>
+        </w:rPr>
+      </w:pPr>
+      <w:proofErr w:type="spellStart"/>
+      <w:r>
+        <w:rPr>
+          <w:color w:val="000000" w:themeColor="text1"/>
+          <w:sz w:val="22"/>
+          <w:szCs w:val="22"/>
+        </w:rPr>
+        <w:t>onClick</w:t>
+      </w:r>
+      <w:proofErr w:type="spellEnd"/>
+      <w:r>
+        <w:rPr>
+          <w:color w:val="000000" w:themeColor="text1"/>
+          <w:sz w:val="22"/>
+          <w:szCs w:val="22"/>
+        </w:rPr>
+        <w:t xml:space="preserve"> is the event, {</w:t>
+      </w:r>
+      <w:proofErr w:type="spellStart"/>
+      <w:r>
+        <w:rPr>
+          <w:color w:val="000000" w:themeColor="text1"/>
+          <w:sz w:val="22"/>
+          <w:szCs w:val="22"/>
+        </w:rPr>
+        <w:t>sendMessage</w:t>
+      </w:r>
+      <w:proofErr w:type="spellEnd"/>
+      <w:r>
+        <w:rPr>
+          <w:color w:val="000000" w:themeColor="text1"/>
+          <w:sz w:val="22"/>
+          <w:szCs w:val="22"/>
+        </w:rPr>
+        <w:t>} is the event handler.</w:t>
       </w:r>
     </w:p>
     <w:p>
@@ -1589,8 +2574,200 @@
           <w:color w:val="000000" w:themeColor="text1"/>
           <w:u w:val="single"/>
         </w:rPr>
+        <w:t>State:</w:t>
+      </w:r>
+    </w:p>
+    <w:p>
+      <w:pPr>
+        <w:rPr>
+          <w:color w:val="000000" w:themeColor="text1"/>
+          <w:sz w:val="22"/>
+          <w:szCs w:val="22"/>
+        </w:rPr>
+      </w:pPr>
+      <w:r>
+        <w:rPr>
+          <w:color w:val="000000" w:themeColor="text1"/>
+          <w:sz w:val="22"/>
+          <w:szCs w:val="22"/>
+        </w:rPr>
+        <w:t xml:space="preserve">state is data that is connected to the html, in our code we have a normal const </w:t>
+      </w:r>
+      <w:proofErr w:type="spellStart"/>
+      <w:r>
+        <w:rPr>
+          <w:color w:val="000000" w:themeColor="text1"/>
+          <w:sz w:val="22"/>
+          <w:szCs w:val="22"/>
+        </w:rPr>
+        <w:t>chatmessages</w:t>
+      </w:r>
+      <w:proofErr w:type="spellEnd"/>
+      <w:r>
+        <w:rPr>
+          <w:color w:val="000000" w:themeColor="text1"/>
+          <w:sz w:val="22"/>
+          <w:szCs w:val="22"/>
+        </w:rPr>
+        <w:t xml:space="preserve"> array of objects, when we update it, it does not show the new array after being updated, to fix this we need to convert it into a state. </w:t>
+      </w:r>
+    </w:p>
+    <w:p>
+      <w:pPr>
+        <w:rPr>
+          <w:color w:val="000000" w:themeColor="text1"/>
+          <w:sz w:val="22"/>
+          <w:szCs w:val="22"/>
+        </w:rPr>
+      </w:pPr>
+      <w:proofErr w:type="spellStart"/>
+      <w:r>
+        <w:rPr>
+          <w:color w:val="000000" w:themeColor="text1"/>
+          <w:sz w:val="22"/>
+          <w:szCs w:val="22"/>
+        </w:rPr>
+        <w:t>React.useState</w:t>
+      </w:r>
+      <w:proofErr w:type="spellEnd"/>
+      <w:proofErr w:type="gramStart"/>
+      <w:r>
+        <w:rPr>
+          <w:color w:val="000000" w:themeColor="text1"/>
+          <w:sz w:val="22"/>
+          <w:szCs w:val="22"/>
+        </w:rPr>
+        <w:t>( here</w:t>
+      </w:r>
+      <w:proofErr w:type="gramEnd"/>
+      <w:r>
+        <w:rPr>
+          <w:color w:val="000000" w:themeColor="text1"/>
+          <w:sz w:val="22"/>
+          <w:szCs w:val="22"/>
+        </w:rPr>
+        <w:t xml:space="preserve"> lives the array of </w:t>
+      </w:r>
+      <w:proofErr w:type="spellStart"/>
+      <w:r>
+        <w:rPr>
+          <w:color w:val="000000" w:themeColor="text1"/>
+          <w:sz w:val="22"/>
+          <w:szCs w:val="22"/>
+        </w:rPr>
+        <w:t>objeccts</w:t>
+      </w:r>
+      <w:proofErr w:type="spellEnd"/>
+      <w:r>
+        <w:rPr>
+          <w:color w:val="000000" w:themeColor="text1"/>
+          <w:sz w:val="22"/>
+          <w:szCs w:val="22"/>
+        </w:rPr>
+        <w:t>);</w:t>
+      </w:r>
+    </w:p>
+    <w:p>
+      <w:pPr>
+        <w:rPr>
+          <w:color w:val="000000" w:themeColor="text1"/>
+          <w:sz w:val="22"/>
+          <w:szCs w:val="22"/>
+        </w:rPr>
+      </w:pPr>
+      <w:r>
+        <w:rPr>
+          <w:color w:val="000000" w:themeColor="text1"/>
+          <w:sz w:val="22"/>
+          <w:szCs w:val="22"/>
+        </w:rPr>
+        <w:t>then we should save that array into a variable to use it</w:t>
+      </w:r>
+    </w:p>
+    <w:p>
+      <w:pPr>
+        <w:rPr>
+          <w:color w:val="000000" w:themeColor="text1"/>
+          <w:sz w:val="22"/>
+          <w:szCs w:val="22"/>
+        </w:rPr>
+      </w:pPr>
+      <w:proofErr w:type="spellStart"/>
+      <w:proofErr w:type="gramStart"/>
+      <w:r>
+        <w:rPr>
+          <w:color w:val="000000" w:themeColor="text1"/>
+          <w:sz w:val="22"/>
+          <w:szCs w:val="22"/>
+        </w:rPr>
+        <w:t>arrayName</w:t>
+      </w:r>
+      <w:proofErr w:type="spellEnd"/>
+      <w:r>
+        <w:rPr>
+          <w:color w:val="000000" w:themeColor="text1"/>
+          <w:sz w:val="22"/>
+          <w:szCs w:val="22"/>
+        </w:rPr>
+        <w:t>[</w:t>
+      </w:r>
+      <w:proofErr w:type="gramEnd"/>
+      <w:r>
+        <w:rPr>
+          <w:color w:val="000000" w:themeColor="text1"/>
+          <w:sz w:val="22"/>
+          <w:szCs w:val="22"/>
+        </w:rPr>
+        <w:t>0] this will always get us the first message (latest)</w:t>
+      </w:r>
+    </w:p>
+    <w:p>
+      <w:pPr>
+        <w:rPr>
+          <w:color w:val="000000" w:themeColor="text1"/>
+          <w:sz w:val="22"/>
+          <w:szCs w:val="22"/>
+        </w:rPr>
+      </w:pPr>
+    </w:p>
+    <w:p>
+      <w:pPr>
+        <w:rPr>
+          <w:b/>
+          <w:bCs/>
+          <w:color w:val="000000" w:themeColor="text1"/>
+          <w:u w:val="single"/>
+        </w:rPr>
+      </w:pPr>
+      <w:r>
+        <w:rPr>
+          <w:b/>
+          <w:bCs/>
+          <w:color w:val="000000" w:themeColor="text1"/>
+          <w:u w:val="single"/>
+        </w:rPr>
         <w:lastRenderedPageBreak/>
-        <w:t>getting input from a text box using the dom:</w:t>
+        <w:t xml:space="preserve">getting input from a text box using the </w:t>
+      </w:r>
+      <w:proofErr w:type="spellStart"/>
+      <w:r>
+        <w:rPr>
+          <w:b/>
+          <w:bCs/>
+          <w:color w:val="000000" w:themeColor="text1"/>
+          <w:u w:val="single"/>
+        </w:rPr>
+        <w:t>dom</w:t>
+      </w:r>
+      <w:proofErr w:type="spellEnd"/>
+      <w:r>
+        <w:rPr>
+          <w:b/>
+          <w:bCs/>
+          <w:color w:val="000000" w:themeColor="text1"/>
+          <w:u w:val="single"/>
+        </w:rPr>
+        <w:t>:</w:t>
       </w:r>
     </w:p>
     <w:p>
@@ -1618,13 +2795,23 @@
           <w:szCs w:val="22"/>
         </w:rPr>
       </w:pPr>
-      <w:r>
-        <w:rPr>
-          <w:color w:val="000000" w:themeColor="text1"/>
-          <w:sz w:val="22"/>
-          <w:szCs w:val="22"/>
-        </w:rPr>
-        <w:t>onChange runs a function when we change the text inside the input box</w:t>
+      <w:proofErr w:type="spellStart"/>
+      <w:r>
+        <w:rPr>
+          <w:color w:val="000000" w:themeColor="text1"/>
+          <w:sz w:val="22"/>
+          <w:szCs w:val="22"/>
+        </w:rPr>
+        <w:t>onChange</w:t>
+      </w:r>
+      <w:proofErr w:type="spellEnd"/>
+      <w:r>
+        <w:rPr>
+          <w:color w:val="000000" w:themeColor="text1"/>
+          <w:sz w:val="22"/>
+          <w:szCs w:val="22"/>
+        </w:rPr>
+        <w:t xml:space="preserve"> runs a function when we change the text inside the input box</w:t>
       </w:r>
       <w:r>
         <w:rPr>
@@ -1686,6 +2873,979 @@
         </w:rPr>
         <w:t>lifting the state up</w:t>
       </w:r>
+    </w:p>
+    <w:p>
+      <w:pPr>
+        <w:rPr>
+          <w:color w:val="000000" w:themeColor="text1"/>
+          <w:sz w:val="22"/>
+          <w:szCs w:val="22"/>
+        </w:rPr>
+      </w:pPr>
+    </w:p>
+    <w:p>
+      <w:pPr>
+        <w:rPr>
+          <w:color w:val="000000" w:themeColor="text1"/>
+          <w:sz w:val="22"/>
+          <w:szCs w:val="22"/>
+        </w:rPr>
+      </w:pPr>
+      <w:r>
+        <w:rPr>
+          <w:color w:val="000000" w:themeColor="text1"/>
+          <w:sz w:val="22"/>
+          <w:szCs w:val="22"/>
+        </w:rPr>
+        <w:t>controlled inputs</w:t>
+      </w:r>
+    </w:p>
+    <w:p>
+      <w:pPr>
+        <w:rPr>
+          <w:color w:val="000000" w:themeColor="text1"/>
+          <w:sz w:val="22"/>
+          <w:szCs w:val="22"/>
+        </w:rPr>
+      </w:pPr>
+    </w:p>
+    <w:p>
+      <w:pPr>
+        <w:rPr>
+          <w:color w:val="000000" w:themeColor="text1"/>
+          <w:sz w:val="22"/>
+          <w:szCs w:val="22"/>
+        </w:rPr>
+      </w:pPr>
+    </w:p>
+    <w:p>
+      <w:pPr>
+        <w:rPr>
+          <w:color w:val="000000" w:themeColor="text1"/>
+          <w:sz w:val="22"/>
+          <w:szCs w:val="22"/>
+        </w:rPr>
+      </w:pPr>
+    </w:p>
+    <w:p>
+      <w:pPr>
+        <w:rPr>
+          <w:b/>
+          <w:bCs/>
+          <w:color w:val="EE0000"/>
+          <w:sz w:val="28"/>
+          <w:szCs w:val="28"/>
+          <w:u w:val="single"/>
+        </w:rPr>
+      </w:pPr>
+      <w:r>
+        <w:rPr>
+          <w:b/>
+          <w:bCs/>
+          <w:color w:val="EE0000"/>
+          <w:sz w:val="28"/>
+          <w:szCs w:val="28"/>
+          <w:u w:val="single"/>
+        </w:rPr>
+        <w:t>CSS</w:t>
+      </w:r>
+      <w:r>
+        <w:rPr>
+          <w:b/>
+          <w:bCs/>
+          <w:color w:val="EE0000"/>
+          <w:sz w:val="28"/>
+          <w:szCs w:val="28"/>
+          <w:u w:val="single"/>
+        </w:rPr>
+        <w:t>:</w:t>
+      </w:r>
+    </w:p>
+    <w:p>
+      <w:pPr>
+        <w:rPr>
+          <w:color w:val="000000" w:themeColor="text1"/>
+          <w:sz w:val="22"/>
+          <w:szCs w:val="22"/>
+        </w:rPr>
+      </w:pPr>
+      <w:r>
+        <w:rPr>
+          <w:color w:val="000000" w:themeColor="text1"/>
+          <w:sz w:val="22"/>
+          <w:szCs w:val="22"/>
+        </w:rPr>
+        <w:t>CSS usage in react is normal we just have to define a &lt;style&gt; &lt;/style&gt; into our header.</w:t>
+      </w:r>
+    </w:p>
+    <w:p>
+      <w:pPr>
+        <w:rPr>
+          <w:color w:val="000000" w:themeColor="text1"/>
+          <w:sz w:val="22"/>
+          <w:szCs w:val="22"/>
+        </w:rPr>
+      </w:pPr>
+    </w:p>
+    <w:p>
+      <w:pPr>
+        <w:rPr>
+          <w:color w:val="000000" w:themeColor="text1"/>
+          <w:sz w:val="22"/>
+          <w:szCs w:val="22"/>
+        </w:rPr>
+      </w:pPr>
+      <w:r>
+        <w:rPr>
+          <w:color w:val="000000" w:themeColor="text1"/>
+          <w:sz w:val="22"/>
+          <w:szCs w:val="22"/>
+        </w:rPr>
+        <w:t>/* Different green shades */</w:t>
+      </w:r>
+    </w:p>
+    <w:p>
+      <w:pPr>
+        <w:rPr>
+          <w:color w:val="EE0000"/>
+          <w:sz w:val="22"/>
+          <w:szCs w:val="22"/>
+        </w:rPr>
+      </w:pPr>
+      <w:r>
+        <w:rPr>
+          <w:color w:val="EE0000"/>
+          <w:sz w:val="22"/>
+          <w:szCs w:val="22"/>
+        </w:rPr>
+        <w:t xml:space="preserve">button </w:t>
+      </w:r>
+      <w:proofErr w:type="gramStart"/>
+      <w:r>
+        <w:rPr>
+          <w:color w:val="EE0000"/>
+          <w:sz w:val="22"/>
+          <w:szCs w:val="22"/>
+        </w:rPr>
+        <w:t>{ background</w:t>
+      </w:r>
+      <w:proofErr w:type="gramEnd"/>
+      <w:r>
+        <w:rPr>
+          <w:color w:val="EE0000"/>
+          <w:sz w:val="22"/>
+          <w:szCs w:val="22"/>
+        </w:rPr>
+        <w:t>-color: #00ff00;</w:t>
+      </w:r>
+    </w:p>
+    <w:p>
+      <w:pPr>
+        <w:ind w:firstLine="720"/>
+        <w:rPr>
+          <w:color w:val="000000" w:themeColor="text1"/>
+          <w:sz w:val="22"/>
+          <w:szCs w:val="22"/>
+        </w:rPr>
+      </w:pPr>
+      <w:r>
+        <w:rPr>
+          <w:color w:val="EE0000"/>
+          <w:sz w:val="22"/>
+          <w:szCs w:val="22"/>
+        </w:rPr>
+        <w:t xml:space="preserve">color: white </w:t>
+      </w:r>
+      <w:r>
+        <w:rPr>
+          <w:color w:val="000000" w:themeColor="text1"/>
+          <w:sz w:val="22"/>
+          <w:szCs w:val="22"/>
+        </w:rPr>
+        <w:sym w:font="Wingdings" w:char="F0E0"/>
+      </w:r>
+      <w:r>
+        <w:rPr>
+          <w:color w:val="000000" w:themeColor="text1"/>
+          <w:sz w:val="22"/>
+          <w:szCs w:val="22"/>
+        </w:rPr>
+        <w:t xml:space="preserve"> this is for the text </w:t>
+      </w:r>
+      <w:proofErr w:type="gramStart"/>
+      <w:r>
+        <w:rPr>
+          <w:color w:val="000000" w:themeColor="text1"/>
+          <w:sz w:val="22"/>
+          <w:szCs w:val="22"/>
+        </w:rPr>
+        <w:t>itself</w:t>
+      </w:r>
+      <w:r>
+        <w:rPr>
+          <w:color w:val="EE0000"/>
+          <w:sz w:val="22"/>
+          <w:szCs w:val="22"/>
+        </w:rPr>
+        <w:t xml:space="preserve"> }</w:t>
+      </w:r>
+      <w:proofErr w:type="gramEnd"/>
+      <w:r>
+        <w:rPr>
+          <w:color w:val="000000" w:themeColor="text1"/>
+          <w:sz w:val="22"/>
+          <w:szCs w:val="22"/>
+        </w:rPr>
+        <w:t xml:space="preserve">  /* Hex code - bright green */</w:t>
+      </w:r>
+      <w:r>
+        <w:rPr>
+          <w:color w:val="000000" w:themeColor="text1"/>
+          <w:sz w:val="22"/>
+          <w:szCs w:val="22"/>
+        </w:rPr>
+        <w:t xml:space="preserve"> changes all button elements</w:t>
+      </w:r>
+    </w:p>
+    <w:p>
+      <w:pPr>
+        <w:rPr>
+          <w:color w:val="000000" w:themeColor="text1"/>
+          <w:sz w:val="22"/>
+          <w:szCs w:val="22"/>
+        </w:rPr>
+      </w:pPr>
+      <w:r>
+        <w:rPr>
+          <w:color w:val="EE0000"/>
+          <w:sz w:val="22"/>
+          <w:szCs w:val="22"/>
+        </w:rPr>
+        <w:t xml:space="preserve">button </w:t>
+      </w:r>
+      <w:proofErr w:type="gramStart"/>
+      <w:r>
+        <w:rPr>
+          <w:color w:val="EE0000"/>
+          <w:sz w:val="22"/>
+          <w:szCs w:val="22"/>
+        </w:rPr>
+        <w:t>{ background</w:t>
+      </w:r>
+      <w:proofErr w:type="gramEnd"/>
+      <w:r>
+        <w:rPr>
+          <w:color w:val="EE0000"/>
+          <w:sz w:val="22"/>
+          <w:szCs w:val="22"/>
+        </w:rPr>
+        <w:t xml:space="preserve">-color: </w:t>
+      </w:r>
+      <w:proofErr w:type="spellStart"/>
+      <w:proofErr w:type="gramStart"/>
+      <w:r>
+        <w:rPr>
+          <w:color w:val="EE0000"/>
+          <w:sz w:val="22"/>
+          <w:szCs w:val="22"/>
+        </w:rPr>
+        <w:t>rgb</w:t>
+      </w:r>
+      <w:proofErr w:type="spellEnd"/>
+      <w:r>
+        <w:rPr>
+          <w:color w:val="EE0000"/>
+          <w:sz w:val="22"/>
+          <w:szCs w:val="22"/>
+        </w:rPr>
+        <w:t>(</w:t>
+      </w:r>
+      <w:proofErr w:type="gramEnd"/>
+      <w:r>
+        <w:rPr>
+          <w:color w:val="EE0000"/>
+          <w:sz w:val="22"/>
+          <w:szCs w:val="22"/>
+        </w:rPr>
+        <w:t>0, 255, 0)</w:t>
+      </w:r>
+      <w:proofErr w:type="gramStart"/>
+      <w:r>
+        <w:rPr>
+          <w:color w:val="EE0000"/>
+          <w:sz w:val="22"/>
+          <w:szCs w:val="22"/>
+        </w:rPr>
+        <w:t>; }</w:t>
+      </w:r>
+      <w:proofErr w:type="gramEnd"/>
+      <w:r>
+        <w:rPr>
+          <w:color w:val="000000" w:themeColor="text1"/>
+          <w:sz w:val="22"/>
+          <w:szCs w:val="22"/>
+        </w:rPr>
+        <w:t xml:space="preserve">  /* RGB - bright green */</w:t>
+      </w:r>
+    </w:p>
+    <w:p>
+      <w:pPr>
+        <w:rPr>
+          <w:color w:val="000000" w:themeColor="text1"/>
+          <w:sz w:val="22"/>
+          <w:szCs w:val="22"/>
+        </w:rPr>
+      </w:pPr>
+      <w:r>
+        <w:rPr>
+          <w:color w:val="EE0000"/>
+          <w:sz w:val="22"/>
+          <w:szCs w:val="22"/>
+        </w:rPr>
+        <w:t xml:space="preserve">button </w:t>
+      </w:r>
+      <w:proofErr w:type="gramStart"/>
+      <w:r>
+        <w:rPr>
+          <w:color w:val="EE0000"/>
+          <w:sz w:val="22"/>
+          <w:szCs w:val="22"/>
+        </w:rPr>
+        <w:t>{ background</w:t>
+      </w:r>
+      <w:proofErr w:type="gramEnd"/>
+      <w:r>
+        <w:rPr>
+          <w:color w:val="EE0000"/>
+          <w:sz w:val="22"/>
+          <w:szCs w:val="22"/>
+        </w:rPr>
+        <w:t xml:space="preserve">-color: </w:t>
+      </w:r>
+      <w:proofErr w:type="spellStart"/>
+      <w:r>
+        <w:rPr>
+          <w:color w:val="EE0000"/>
+          <w:sz w:val="22"/>
+          <w:szCs w:val="22"/>
+        </w:rPr>
+        <w:t>darkgreen</w:t>
+      </w:r>
+      <w:proofErr w:type="spellEnd"/>
+      <w:proofErr w:type="gramStart"/>
+      <w:r>
+        <w:rPr>
+          <w:color w:val="EE0000"/>
+          <w:sz w:val="22"/>
+          <w:szCs w:val="22"/>
+        </w:rPr>
+        <w:t>; }</w:t>
+      </w:r>
+      <w:proofErr w:type="gramEnd"/>
+      <w:r>
+        <w:rPr>
+          <w:color w:val="000000" w:themeColor="text1"/>
+          <w:sz w:val="22"/>
+          <w:szCs w:val="22"/>
+        </w:rPr>
+        <w:t xml:space="preserve">  /* Named color - darker */</w:t>
+      </w:r>
+    </w:p>
+    <w:p>
+      <w:pPr>
+        <w:rPr>
+          <w:color w:val="000000" w:themeColor="text1"/>
+          <w:sz w:val="22"/>
+          <w:szCs w:val="22"/>
+        </w:rPr>
+      </w:pPr>
+    </w:p>
+    <w:p>
+      <w:pPr>
+        <w:rPr>
+          <w:color w:val="000000" w:themeColor="text1"/>
+          <w:sz w:val="22"/>
+          <w:szCs w:val="22"/>
+        </w:rPr>
+      </w:pPr>
+      <w:r>
+        <w:rPr>
+          <w:color w:val="000000" w:themeColor="text1"/>
+          <w:sz w:val="22"/>
+          <w:szCs w:val="22"/>
+        </w:rPr>
+        <w:t>/* More specific targeting */</w:t>
+      </w:r>
+    </w:p>
+    <w:p>
+      <w:pPr>
+        <w:rPr>
+          <w:color w:val="000000" w:themeColor="text1"/>
+          <w:sz w:val="22"/>
+          <w:szCs w:val="22"/>
+        </w:rPr>
+      </w:pPr>
+      <w:proofErr w:type="gramStart"/>
+      <w:r>
+        <w:rPr>
+          <w:color w:val="EE0000"/>
+          <w:sz w:val="22"/>
+          <w:szCs w:val="22"/>
+        </w:rPr>
+        <w:t>.primary</w:t>
+      </w:r>
+      <w:proofErr w:type="gramEnd"/>
+      <w:r>
+        <w:rPr>
+          <w:color w:val="EE0000"/>
+          <w:sz w:val="22"/>
+          <w:szCs w:val="22"/>
+        </w:rPr>
+        <w:t xml:space="preserve">-button </w:t>
+      </w:r>
+      <w:proofErr w:type="gramStart"/>
+      <w:r>
+        <w:rPr>
+          <w:color w:val="EE0000"/>
+          <w:sz w:val="22"/>
+          <w:szCs w:val="22"/>
+        </w:rPr>
+        <w:t>{ background</w:t>
+      </w:r>
+      <w:proofErr w:type="gramEnd"/>
+      <w:r>
+        <w:rPr>
+          <w:color w:val="EE0000"/>
+          <w:sz w:val="22"/>
+          <w:szCs w:val="22"/>
+        </w:rPr>
+        <w:t>-color: green</w:t>
+      </w:r>
+      <w:proofErr w:type="gramStart"/>
+      <w:r>
+        <w:rPr>
+          <w:color w:val="EE0000"/>
+          <w:sz w:val="22"/>
+          <w:szCs w:val="22"/>
+        </w:rPr>
+        <w:t>; }</w:t>
+      </w:r>
+      <w:proofErr w:type="gramEnd"/>
+      <w:r>
+        <w:rPr>
+          <w:color w:val="000000" w:themeColor="text1"/>
+          <w:sz w:val="22"/>
+          <w:szCs w:val="22"/>
+        </w:rPr>
+        <w:t xml:space="preserve">  /* Only buttons with class="primary-button" */</w:t>
+      </w:r>
+    </w:p>
+    <w:p>
+      <w:pPr>
+        <w:rPr>
+          <w:color w:val="000000" w:themeColor="text1"/>
+          <w:sz w:val="22"/>
+          <w:szCs w:val="22"/>
+        </w:rPr>
+      </w:pPr>
+      <w:r>
+        <w:rPr>
+          <w:color w:val="EE0000"/>
+          <w:sz w:val="22"/>
+          <w:szCs w:val="22"/>
+        </w:rPr>
+        <w:t>#</w:t>
+      </w:r>
+      <w:proofErr w:type="gramStart"/>
+      <w:r>
+        <w:rPr>
+          <w:color w:val="EE0000"/>
+          <w:sz w:val="22"/>
+          <w:szCs w:val="22"/>
+        </w:rPr>
+        <w:t>submit</w:t>
+      </w:r>
+      <w:proofErr w:type="gramEnd"/>
+      <w:r>
+        <w:rPr>
+          <w:color w:val="EE0000"/>
+          <w:sz w:val="22"/>
+          <w:szCs w:val="22"/>
+        </w:rPr>
+        <w:t xml:space="preserve">-btn </w:t>
+      </w:r>
+      <w:proofErr w:type="gramStart"/>
+      <w:r>
+        <w:rPr>
+          <w:color w:val="EE0000"/>
+          <w:sz w:val="22"/>
+          <w:szCs w:val="22"/>
+        </w:rPr>
+        <w:t>{ background</w:t>
+      </w:r>
+      <w:proofErr w:type="gramEnd"/>
+      <w:r>
+        <w:rPr>
+          <w:color w:val="EE0000"/>
+          <w:sz w:val="22"/>
+          <w:szCs w:val="22"/>
+        </w:rPr>
+        <w:t>-color: green</w:t>
+      </w:r>
+      <w:proofErr w:type="gramStart"/>
+      <w:r>
+        <w:rPr>
+          <w:color w:val="EE0000"/>
+          <w:sz w:val="22"/>
+          <w:szCs w:val="22"/>
+        </w:rPr>
+        <w:t>; }</w:t>
+      </w:r>
+      <w:proofErr w:type="gramEnd"/>
+      <w:r>
+        <w:rPr>
+          <w:color w:val="000000" w:themeColor="text1"/>
+          <w:sz w:val="22"/>
+          <w:szCs w:val="22"/>
+        </w:rPr>
+        <w:t xml:space="preserve">  /* Only button with id="submit-</w:t>
+      </w:r>
+      <w:proofErr w:type="spellStart"/>
+      <w:r>
+        <w:rPr>
+          <w:color w:val="000000" w:themeColor="text1"/>
+          <w:sz w:val="22"/>
+          <w:szCs w:val="22"/>
+        </w:rPr>
+        <w:t>btn</w:t>
+      </w:r>
+      <w:proofErr w:type="spellEnd"/>
+      <w:r>
+        <w:rPr>
+          <w:color w:val="000000" w:themeColor="text1"/>
+          <w:sz w:val="22"/>
+          <w:szCs w:val="22"/>
+        </w:rPr>
+        <w:t>" */</w:t>
+      </w:r>
+    </w:p>
+    <w:p>
+      <w:pPr>
+        <w:rPr>
+          <w:color w:val="000000" w:themeColor="text1"/>
+          <w:sz w:val="22"/>
+          <w:szCs w:val="22"/>
+        </w:rPr>
+      </w:pPr>
+      <w:r>
+        <w:rPr>
+          <w:color w:val="EE0000"/>
+          <w:sz w:val="22"/>
+          <w:szCs w:val="22"/>
+        </w:rPr>
+        <w:t xml:space="preserve">form button </w:t>
+      </w:r>
+      <w:proofErr w:type="gramStart"/>
+      <w:r>
+        <w:rPr>
+          <w:color w:val="EE0000"/>
+          <w:sz w:val="22"/>
+          <w:szCs w:val="22"/>
+        </w:rPr>
+        <w:t>{ background</w:t>
+      </w:r>
+      <w:proofErr w:type="gramEnd"/>
+      <w:r>
+        <w:rPr>
+          <w:color w:val="EE0000"/>
+          <w:sz w:val="22"/>
+          <w:szCs w:val="22"/>
+        </w:rPr>
+        <w:t>-color: green</w:t>
+      </w:r>
+      <w:proofErr w:type="gramStart"/>
+      <w:r>
+        <w:rPr>
+          <w:color w:val="EE0000"/>
+          <w:sz w:val="22"/>
+          <w:szCs w:val="22"/>
+        </w:rPr>
+        <w:t>; }</w:t>
+      </w:r>
+      <w:proofErr w:type="gramEnd"/>
+      <w:r>
+        <w:rPr>
+          <w:color w:val="EE0000"/>
+          <w:sz w:val="22"/>
+          <w:szCs w:val="22"/>
+        </w:rPr>
+        <w:t xml:space="preserve">  </w:t>
+      </w:r>
+      <w:r>
+        <w:rPr>
+          <w:color w:val="000000" w:themeColor="text1"/>
+          <w:sz w:val="22"/>
+          <w:szCs w:val="22"/>
+        </w:rPr>
+        <w:t>/* Only buttons inside forms */</w:t>
+      </w:r>
+    </w:p>
+    <w:p>
+      <w:pPr>
+        <w:rPr>
+          <w:color w:val="000000" w:themeColor="text1"/>
+          <w:sz w:val="22"/>
+          <w:szCs w:val="22"/>
+        </w:rPr>
+      </w:pPr>
+    </w:p>
+    <w:p>
+      <w:pPr>
+        <w:rPr>
+          <w:color w:val="000000" w:themeColor="text1"/>
+          <w:sz w:val="22"/>
+          <w:szCs w:val="22"/>
+        </w:rPr>
+      </w:pPr>
+      <w:r>
+        <w:rPr>
+          <w:color w:val="000000" w:themeColor="text1"/>
+          <w:sz w:val="22"/>
+          <w:szCs w:val="22"/>
+        </w:rPr>
+        <w:lastRenderedPageBreak/>
+        <w:t>space in the inside of an element is called padding. from the outside between itself and other is called margin</w:t>
+      </w:r>
+    </w:p>
+    <w:p>
+      <w:pPr>
+        <w:rPr>
+          <w:color w:val="000000" w:themeColor="text1"/>
+          <w:sz w:val="22"/>
+          <w:szCs w:val="22"/>
+        </w:rPr>
+      </w:pPr>
+    </w:p>
+    <w:p>
+      <w:pPr>
+        <w:rPr>
+          <w:color w:val="000000" w:themeColor="text1"/>
+          <w:sz w:val="22"/>
+          <w:szCs w:val="22"/>
+        </w:rPr>
+      </w:pPr>
+      <w:r>
+        <w:rPr>
+          <w:b/>
+          <w:bCs/>
+          <w:color w:val="000000" w:themeColor="text1"/>
+          <w:sz w:val="22"/>
+          <w:szCs w:val="22"/>
+        </w:rPr>
+        <w:t xml:space="preserve">padding: 12 </w:t>
+      </w:r>
+      <w:proofErr w:type="gramStart"/>
+      <w:r>
+        <w:rPr>
+          <w:b/>
+          <w:bCs/>
+          <w:color w:val="000000" w:themeColor="text1"/>
+          <w:sz w:val="22"/>
+          <w:szCs w:val="22"/>
+        </w:rPr>
+        <w:t xml:space="preserve">20; </w:t>
+      </w:r>
+      <w:r>
+        <w:rPr>
+          <w:color w:val="000000" w:themeColor="text1"/>
+          <w:sz w:val="22"/>
+          <w:szCs w:val="22"/>
+        </w:rPr>
+        <w:t xml:space="preserve"> the</w:t>
+      </w:r>
+      <w:proofErr w:type="gramEnd"/>
+      <w:r>
+        <w:rPr>
+          <w:color w:val="000000" w:themeColor="text1"/>
+          <w:sz w:val="22"/>
+          <w:szCs w:val="22"/>
+        </w:rPr>
+        <w:t xml:space="preserve"> 12 represents the vertical padding the second represents the horizontal padding</w:t>
+      </w:r>
+    </w:p>
+    <w:p>
+      <w:pPr>
+        <w:rPr>
+          <w:color w:val="000000" w:themeColor="text1"/>
+          <w:sz w:val="22"/>
+          <w:szCs w:val="22"/>
+        </w:rPr>
+      </w:pPr>
+    </w:p>
+    <w:p>
+      <w:pPr>
+        <w:rPr>
+          <w:color w:val="000000" w:themeColor="text1"/>
+          <w:sz w:val="22"/>
+          <w:szCs w:val="22"/>
+        </w:rPr>
+      </w:pPr>
+      <w:proofErr w:type="gramStart"/>
+      <w:r>
+        <w:rPr>
+          <w:color w:val="000000" w:themeColor="text1"/>
+          <w:sz w:val="22"/>
+          <w:szCs w:val="22"/>
+        </w:rPr>
+        <w:t>.send</w:t>
+      </w:r>
+      <w:proofErr w:type="gramEnd"/>
+      <w:r>
+        <w:rPr>
+          <w:color w:val="000000" w:themeColor="text1"/>
+          <w:sz w:val="22"/>
+          <w:szCs w:val="22"/>
+        </w:rPr>
+        <w:t>-button {</w:t>
+      </w:r>
+      <w:r>
+        <w:rPr>
+          <w:color w:val="000000" w:themeColor="text1"/>
+          <w:sz w:val="22"/>
+          <w:szCs w:val="22"/>
+        </w:rPr>
+        <w:br/>
+        <w:t xml:space="preserve">  background-color: #086508;</w:t>
+      </w:r>
+      <w:r>
+        <w:rPr>
+          <w:color w:val="000000" w:themeColor="text1"/>
+          <w:sz w:val="22"/>
+          <w:szCs w:val="22"/>
+        </w:rPr>
+        <w:br/>
+        <w:t xml:space="preserve">  color: white;</w:t>
+      </w:r>
+      <w:r>
+        <w:rPr>
+          <w:color w:val="000000" w:themeColor="text1"/>
+          <w:sz w:val="22"/>
+          <w:szCs w:val="22"/>
+        </w:rPr>
+        <w:br/>
+        <w:t xml:space="preserve">  padding: 12px 20px;</w:t>
+      </w:r>
+      <w:r>
+        <w:rPr>
+          <w:color w:val="000000" w:themeColor="text1"/>
+          <w:sz w:val="22"/>
+          <w:szCs w:val="22"/>
+        </w:rPr>
+        <w:br/>
+        <w:t xml:space="preserve">  margin-left: 10px;</w:t>
+      </w:r>
+      <w:r>
+        <w:rPr>
+          <w:color w:val="000000" w:themeColor="text1"/>
+          <w:sz w:val="22"/>
+          <w:szCs w:val="22"/>
+        </w:rPr>
+        <w:br/>
+        <w:t xml:space="preserve">  border: none;</w:t>
+      </w:r>
+      <w:r>
+        <w:rPr>
+          <w:color w:val="000000" w:themeColor="text1"/>
+          <w:sz w:val="22"/>
+          <w:szCs w:val="22"/>
+        </w:rPr>
+        <w:br/>
+        <w:t xml:space="preserve">  border-radius: 10px;</w:t>
+      </w:r>
+      <w:r>
+        <w:rPr>
+          <w:color w:val="000000" w:themeColor="text1"/>
+          <w:sz w:val="22"/>
+          <w:szCs w:val="22"/>
+        </w:rPr>
+        <w:br/>
+        <w:t xml:space="preserve">  font-size: 15px;</w:t>
+      </w:r>
+      <w:r>
+        <w:rPr>
+          <w:color w:val="000000" w:themeColor="text1"/>
+          <w:sz w:val="22"/>
+          <w:szCs w:val="22"/>
+        </w:rPr>
+        <w:br/>
+        <w:t xml:space="preserve">  cursor: pointer;</w:t>
+      </w:r>
+      <w:r>
+        <w:rPr>
+          <w:color w:val="000000" w:themeColor="text1"/>
+          <w:sz w:val="22"/>
+          <w:szCs w:val="22"/>
+        </w:rPr>
+        <w:br/>
+        <w:t>}</w:t>
+      </w:r>
+    </w:p>
+    <w:p>
+      <w:pPr>
+        <w:rPr>
+          <w:color w:val="000000" w:themeColor="text1"/>
+          <w:sz w:val="22"/>
+          <w:szCs w:val="22"/>
+        </w:rPr>
+      </w:pPr>
+    </w:p>
+    <w:p>
+      <w:pPr>
+        <w:rPr>
+          <w:color w:val="000000" w:themeColor="text1"/>
+          <w:sz w:val="22"/>
+          <w:szCs w:val="22"/>
+        </w:rPr>
+      </w:pPr>
+      <w:r>
+        <w:rPr>
+          <w:color w:val="000000" w:themeColor="text1"/>
+          <w:sz w:val="22"/>
+          <w:szCs w:val="22"/>
+        </w:rPr>
+        <w:t xml:space="preserve">we cannot style a fragment with </w:t>
+      </w:r>
+      <w:proofErr w:type="spellStart"/>
+      <w:r>
+        <w:rPr>
+          <w:color w:val="000000" w:themeColor="text1"/>
+          <w:sz w:val="22"/>
+          <w:szCs w:val="22"/>
+        </w:rPr>
+        <w:t>css</w:t>
+      </w:r>
+      <w:proofErr w:type="spellEnd"/>
+      <w:r>
+        <w:rPr>
+          <w:color w:val="000000" w:themeColor="text1"/>
+          <w:sz w:val="22"/>
+          <w:szCs w:val="22"/>
+        </w:rPr>
+        <w:t xml:space="preserve"> in react so we need to switch from a fragment into a div</w:t>
+      </w:r>
+    </w:p>
+    <w:p>
+      <w:pPr>
+        <w:rPr>
+          <w:color w:val="000000" w:themeColor="text1"/>
+          <w:sz w:val="22"/>
+          <w:szCs w:val="22"/>
+        </w:rPr>
+      </w:pPr>
+    </w:p>
+    <w:p>
+      <w:pPr>
+        <w:rPr>
+          <w:color w:val="000000" w:themeColor="text1"/>
+          <w:sz w:val="22"/>
+          <w:szCs w:val="22"/>
+        </w:rPr>
+      </w:pPr>
+      <w:r>
+        <w:rPr>
+          <w:color w:val="000000" w:themeColor="text1"/>
+          <w:sz w:val="22"/>
+          <w:szCs w:val="22"/>
+        </w:rPr>
+        <w:t xml:space="preserve">flex-grow: makes an element grow and takes the remaining space, </w:t>
+      </w:r>
+    </w:p>
+    <w:p>
+      <w:pPr>
+        <w:rPr>
+          <w:color w:val="000000" w:themeColor="text1"/>
+          <w:sz w:val="22"/>
+          <w:szCs w:val="22"/>
+        </w:rPr>
+      </w:pPr>
+      <w:r>
+        <w:rPr>
+          <w:color w:val="000000" w:themeColor="text1"/>
+          <w:sz w:val="22"/>
+          <w:szCs w:val="22"/>
+        </w:rPr>
+        <w:t>justify-content: controls how the elements are displayed horizontally</w:t>
+      </w:r>
+    </w:p>
+    <w:p>
+      <w:pPr>
+        <w:rPr>
+          <w:color w:val="000000" w:themeColor="text1"/>
+          <w:sz w:val="22"/>
+          <w:szCs w:val="22"/>
+        </w:rPr>
+      </w:pPr>
+    </w:p>
+    <w:p>
+      <w:pPr>
+        <w:rPr>
+          <w:color w:val="000000" w:themeColor="text1"/>
+          <w:sz w:val="22"/>
+          <w:szCs w:val="22"/>
+        </w:rPr>
+      </w:pPr>
+      <w:r>
+        <w:rPr>
+          <w:color w:val="000000" w:themeColor="text1"/>
+          <w:sz w:val="22"/>
+          <w:szCs w:val="22"/>
+        </w:rPr>
+        <w:t>overflow: scroll;</w:t>
+      </w:r>
+    </w:p>
+    <w:p>
+      <w:pPr>
+        <w:rPr>
+          <w:color w:val="000000" w:themeColor="text1"/>
+          <w:sz w:val="22"/>
+          <w:szCs w:val="22"/>
+        </w:rPr>
+      </w:pPr>
+    </w:p>
+    <w:p>
+      <w:pPr>
+        <w:rPr>
+          <w:color w:val="000000" w:themeColor="text1"/>
+          <w:sz w:val="22"/>
+          <w:szCs w:val="22"/>
+        </w:rPr>
+      </w:pPr>
+    </w:p>
+    <w:p>
+      <w:pPr>
+        <w:rPr>
+          <w:color w:val="000000" w:themeColor="text1"/>
+          <w:sz w:val="22"/>
+          <w:szCs w:val="22"/>
+        </w:rPr>
+      </w:pPr>
+      <w:r>
+        <w:rPr>
+          <w:color w:val="000000" w:themeColor="text1"/>
+          <w:sz w:val="22"/>
+          <w:szCs w:val="22"/>
+        </w:rPr>
+        <w:t>hooks, they let us insert react features directly into our components</w:t>
+      </w:r>
+    </w:p>
+    <w:p>
+      <w:pPr>
+        <w:rPr>
+          <w:color w:val="000000" w:themeColor="text1"/>
+          <w:sz w:val="22"/>
+          <w:szCs w:val="22"/>
+        </w:rPr>
+      </w:pPr>
     </w:p>
     <w:sectPr>
       <w:pgSz w:w="12240" w:h="15840"/>

</xml_diff>

<commit_message>
add lesson 5 notes and finalise bot project practice
</commit_message>
<xml_diff>
--- a/practice_profile/React Notes.docx
+++ b/practice_profile/React Notes.docx
@@ -130,7 +130,25 @@
           <w:sz w:val="22"/>
           <w:szCs w:val="22"/>
         </w:rPr>
-        <w:t xml:space="preserve">const container = document.querySelector('.js-container'); </w:t>
+        <w:t xml:space="preserve">const container = </w:t>
+      </w:r>
+      <w:proofErr w:type="gramStart"/>
+      <w:r>
+        <w:rPr>
+          <w:color w:val="EE0000"/>
+          <w:sz w:val="22"/>
+          <w:szCs w:val="22"/>
+        </w:rPr>
+        <w:t>document.querySelector</w:t>
+      </w:r>
+      <w:proofErr w:type="gramEnd"/>
+      <w:r>
+        <w:rPr>
+          <w:color w:val="EE0000"/>
+          <w:sz w:val="22"/>
+          <w:szCs w:val="22"/>
+        </w:rPr>
+        <w:t xml:space="preserve">('.js-container'); </w:t>
       </w:r>
     </w:p>
     <w:p>
@@ -160,7 +178,23 @@
           <w:sz w:val="22"/>
           <w:szCs w:val="22"/>
         </w:rPr>
-        <w:t>then when we render we will fill that container aka div</w:t>
+        <w:t xml:space="preserve">then when we </w:t>
+      </w:r>
+      <w:proofErr w:type="gramStart"/>
+      <w:r>
+        <w:rPr>
+          <w:sz w:val="22"/>
+          <w:szCs w:val="22"/>
+        </w:rPr>
+        <w:t>render</w:t>
+      </w:r>
+      <w:proofErr w:type="gramEnd"/>
+      <w:r>
+        <w:rPr>
+          <w:sz w:val="22"/>
+          <w:szCs w:val="22"/>
+        </w:rPr>
+        <w:t xml:space="preserve"> we will fill that container aka div</w:t>
       </w:r>
     </w:p>
     <w:p>
@@ -213,7 +247,25 @@
           <w:sz w:val="22"/>
           <w:szCs w:val="22"/>
         </w:rPr>
-        <w:t>ReactDOM.createRoot(container).render(&lt;App /&gt;);</w:t>
+        <w:t>ReactDOM.createRoot(container</w:t>
+      </w:r>
+      <w:proofErr w:type="gramStart"/>
+      <w:r>
+        <w:rPr>
+          <w:color w:val="EE0000"/>
+          <w:sz w:val="22"/>
+          <w:szCs w:val="22"/>
+        </w:rPr>
+        <w:t>).render</w:t>
+      </w:r>
+      <w:proofErr w:type="gramEnd"/>
+      <w:r>
+        <w:rPr>
+          <w:color w:val="EE0000"/>
+          <w:sz w:val="22"/>
+          <w:szCs w:val="22"/>
+        </w:rPr>
+        <w:t>(&lt;App /&gt;);</w:t>
       </w:r>
     </w:p>
     <w:p>
@@ -265,7 +317,25 @@
           <w:sz w:val="22"/>
           <w:szCs w:val="22"/>
         </w:rPr>
-        <w:t>we include the babel cause it translates other programming languages or non programming languages into javascript</w:t>
+        <w:t xml:space="preserve">we include the babel </w:t>
+      </w:r>
+      <w:proofErr w:type="gramStart"/>
+      <w:r>
+        <w:rPr>
+          <w:color w:val="000000" w:themeColor="text1"/>
+          <w:sz w:val="22"/>
+          <w:szCs w:val="22"/>
+        </w:rPr>
+        <w:t>cause</w:t>
+      </w:r>
+      <w:proofErr w:type="gramEnd"/>
+      <w:r>
+        <w:rPr>
+          <w:color w:val="000000" w:themeColor="text1"/>
+          <w:sz w:val="22"/>
+          <w:szCs w:val="22"/>
+        </w:rPr>
+        <w:t xml:space="preserve"> it translates other programming languages or non programming languages into javascript</w:t>
       </w:r>
       <w:r>
         <w:rPr>
@@ -340,33 +410,105 @@
           <w:sz w:val="22"/>
           <w:szCs w:val="22"/>
         </w:rPr>
-        <w:t>to display things we use the .render() however we cant pass multiple elements inside it, what we can do is to create a div and save it into a javascript variable and this variable we pass to the render.</w:t>
-      </w:r>
-    </w:p>
-    <w:p>
-      <w:pPr>
-        <w:rPr>
-          <w:color w:val="000000" w:themeColor="text1"/>
-          <w:sz w:val="22"/>
-          <w:szCs w:val="22"/>
-        </w:rPr>
-      </w:pPr>
-    </w:p>
-    <w:p>
-      <w:pPr>
-        <w:rPr>
-          <w:color w:val="000000" w:themeColor="text1"/>
-          <w:sz w:val="22"/>
-          <w:szCs w:val="22"/>
-        </w:rPr>
-      </w:pPr>
-      <w:r>
-        <w:rPr>
-          <w:color w:val="000000" w:themeColor="text1"/>
-          <w:sz w:val="22"/>
-          <w:szCs w:val="22"/>
-        </w:rPr>
-        <w:t>when we have multiple elements in html saved to a JS constant or variable it’s the best practice to surround them with ( ).</w:t>
+        <w:t xml:space="preserve">to display </w:t>
+      </w:r>
+      <w:proofErr w:type="gramStart"/>
+      <w:r>
+        <w:rPr>
+          <w:color w:val="000000" w:themeColor="text1"/>
+          <w:sz w:val="22"/>
+          <w:szCs w:val="22"/>
+        </w:rPr>
+        <w:t>things</w:t>
+      </w:r>
+      <w:proofErr w:type="gramEnd"/>
+      <w:r>
+        <w:rPr>
+          <w:color w:val="000000" w:themeColor="text1"/>
+          <w:sz w:val="22"/>
+          <w:szCs w:val="22"/>
+        </w:rPr>
+        <w:t xml:space="preserve"> we use </w:t>
+      </w:r>
+      <w:proofErr w:type="gramStart"/>
+      <w:r>
+        <w:rPr>
+          <w:color w:val="000000" w:themeColor="text1"/>
+          <w:sz w:val="22"/>
+          <w:szCs w:val="22"/>
+        </w:rPr>
+        <w:t>the .render</w:t>
+      </w:r>
+      <w:proofErr w:type="gramEnd"/>
+      <w:r>
+        <w:rPr>
+          <w:color w:val="000000" w:themeColor="text1"/>
+          <w:sz w:val="22"/>
+          <w:szCs w:val="22"/>
+        </w:rPr>
+        <w:t xml:space="preserve">() however we </w:t>
+      </w:r>
+      <w:proofErr w:type="gramStart"/>
+      <w:r>
+        <w:rPr>
+          <w:color w:val="000000" w:themeColor="text1"/>
+          <w:sz w:val="22"/>
+          <w:szCs w:val="22"/>
+        </w:rPr>
+        <w:t>cant</w:t>
+      </w:r>
+      <w:proofErr w:type="gramEnd"/>
+      <w:r>
+        <w:rPr>
+          <w:color w:val="000000" w:themeColor="text1"/>
+          <w:sz w:val="22"/>
+          <w:szCs w:val="22"/>
+        </w:rPr>
+        <w:t xml:space="preserve"> pass multiple elements inside it, what we can do is to create a div and save it into a javascript variable and this variable we pass to the render.</w:t>
+      </w:r>
+    </w:p>
+    <w:p>
+      <w:pPr>
+        <w:rPr>
+          <w:color w:val="000000" w:themeColor="text1"/>
+          <w:sz w:val="22"/>
+          <w:szCs w:val="22"/>
+        </w:rPr>
+      </w:pPr>
+    </w:p>
+    <w:p>
+      <w:pPr>
+        <w:rPr>
+          <w:color w:val="000000" w:themeColor="text1"/>
+          <w:sz w:val="22"/>
+          <w:szCs w:val="22"/>
+        </w:rPr>
+      </w:pPr>
+      <w:r>
+        <w:rPr>
+          <w:color w:val="000000" w:themeColor="text1"/>
+          <w:sz w:val="22"/>
+          <w:szCs w:val="22"/>
+        </w:rPr>
+        <w:t xml:space="preserve">when we have multiple elements in html saved to a JS constant or variable it’s the best practice to surround them with </w:t>
+      </w:r>
+      <w:proofErr w:type="gramStart"/>
+      <w:r>
+        <w:rPr>
+          <w:color w:val="000000" w:themeColor="text1"/>
+          <w:sz w:val="22"/>
+          <w:szCs w:val="22"/>
+        </w:rPr>
+        <w:t>( )</w:t>
+      </w:r>
+      <w:proofErr w:type="gramEnd"/>
+      <w:r>
+        <w:rPr>
+          <w:color w:val="000000" w:themeColor="text1"/>
+          <w:sz w:val="22"/>
+          <w:szCs w:val="22"/>
+        </w:rPr>
+        <w:t>.</w:t>
       </w:r>
     </w:p>
     <w:p>
@@ -402,7 +544,25 @@
           <w:szCs w:val="22"/>
         </w:rPr>
         <w:lastRenderedPageBreak/>
-        <w:t xml:space="preserve">in JSX its totally valid to pass a JS code inside our html for example </w:t>
+        <w:t xml:space="preserve">in JSX </w:t>
+      </w:r>
+      <w:proofErr w:type="gramStart"/>
+      <w:r>
+        <w:rPr>
+          <w:color w:val="000000" w:themeColor="text1"/>
+          <w:sz w:val="22"/>
+          <w:szCs w:val="22"/>
+        </w:rPr>
+        <w:t>its</w:t>
+      </w:r>
+      <w:proofErr w:type="gramEnd"/>
+      <w:r>
+        <w:rPr>
+          <w:color w:val="000000" w:themeColor="text1"/>
+          <w:sz w:val="22"/>
+          <w:szCs w:val="22"/>
+        </w:rPr>
+        <w:t xml:space="preserve"> totally valid to pass a JS code inside our html for example </w:t>
       </w:r>
     </w:p>
     <w:p>
@@ -488,7 +648,25 @@
           <w:sz w:val="22"/>
           <w:szCs w:val="22"/>
         </w:rPr>
-        <w:t>we can create components in react by creating a js function function name (){}</w:t>
+        <w:t xml:space="preserve">we can create components in react by creating a js function function name </w:t>
+      </w:r>
+      <w:proofErr w:type="gramStart"/>
+      <w:r>
+        <w:rPr>
+          <w:color w:val="000000" w:themeColor="text1"/>
+          <w:sz w:val="22"/>
+          <w:szCs w:val="22"/>
+        </w:rPr>
+        <w:t>(){</w:t>
+      </w:r>
+      <w:proofErr w:type="gramEnd"/>
+      <w:r>
+        <w:rPr>
+          <w:color w:val="000000" w:themeColor="text1"/>
+          <w:sz w:val="22"/>
+          <w:szCs w:val="22"/>
+        </w:rPr>
+        <w:t>}</w:t>
       </w:r>
     </w:p>
     <w:p>
@@ -522,8 +700,18 @@
           <w:sz w:val="22"/>
           <w:szCs w:val="22"/>
         </w:rPr>
-        <w:t>function FirstComponent(){</w:t>
-      </w:r>
+        <w:t xml:space="preserve">function </w:t>
+      </w:r>
+      <w:proofErr w:type="gramStart"/>
+      <w:r>
+        <w:rPr>
+          <w:color w:val="EE0000"/>
+          <w:sz w:val="22"/>
+          <w:szCs w:val="22"/>
+        </w:rPr>
+        <w:t>FirstComponent(){</w:t>
+      </w:r>
+      <w:proofErr w:type="gramEnd"/>
     </w:p>
     <w:p>
       <w:pPr>
@@ -540,6 +728,14 @@
           <w:szCs w:val="22"/>
         </w:rPr>
         <w:tab/>
+      </w:r>
+      <w:proofErr w:type="gramStart"/>
+      <w:r>
+        <w:rPr>
+          <w:color w:val="EE0000"/>
+          <w:sz w:val="22"/>
+          <w:szCs w:val="22"/>
+        </w:rPr>
         <w:t>return</w:t>
       </w:r>
       <w:r>
@@ -550,6 +746,7 @@
         </w:rPr>
         <w:t>(</w:t>
       </w:r>
+      <w:proofErr w:type="gramEnd"/>
     </w:p>
     <w:p>
       <w:pPr>
@@ -627,7 +824,25 @@
           <w:sz w:val="22"/>
           <w:szCs w:val="22"/>
         </w:rPr>
-        <w:t>when we return an html element from a function we cant return multiple elements so it’s the best practice to return a div that includes multiple elements</w:t>
+        <w:t xml:space="preserve">when we return an html element from a function we </w:t>
+      </w:r>
+      <w:proofErr w:type="gramStart"/>
+      <w:r>
+        <w:rPr>
+          <w:color w:val="000000" w:themeColor="text1"/>
+          <w:sz w:val="22"/>
+          <w:szCs w:val="22"/>
+        </w:rPr>
+        <w:t>cant</w:t>
+      </w:r>
+      <w:proofErr w:type="gramEnd"/>
+      <w:r>
+        <w:rPr>
+          <w:color w:val="000000" w:themeColor="text1"/>
+          <w:sz w:val="22"/>
+          <w:szCs w:val="22"/>
+        </w:rPr>
+        <w:t xml:space="preserve"> return multiple elements so it’s the best practice to return a div that includes multiple elements</w:t>
       </w:r>
     </w:p>
     <w:p>
@@ -721,8 +936,18 @@
           <w:sz w:val="22"/>
           <w:szCs w:val="22"/>
         </w:rPr>
-        <w:t>function FunctionName (props){</w:t>
-      </w:r>
+        <w:t>function FunctionName (props</w:t>
+      </w:r>
+      <w:proofErr w:type="gramStart"/>
+      <w:r>
+        <w:rPr>
+          <w:color w:val="EE0000"/>
+          <w:sz w:val="22"/>
+          <w:szCs w:val="22"/>
+        </w:rPr>
+        <w:t>){</w:t>
+      </w:r>
+      <w:proofErr w:type="gramEnd"/>
     </w:p>
     <w:p>
       <w:pPr>
@@ -764,24 +989,96 @@
           <w:sz w:val="22"/>
           <w:szCs w:val="22"/>
         </w:rPr>
-        <w:t>inside this props will be all the attributes for a function stored</w:t>
-      </w:r>
-    </w:p>
-    <w:p>
-      <w:pPr>
-        <w:rPr>
-          <w:color w:val="EE0000"/>
-          <w:sz w:val="22"/>
-          <w:szCs w:val="22"/>
-        </w:rPr>
-      </w:pPr>
-      <w:r>
-        <w:rPr>
-          <w:color w:val="EE0000"/>
-          <w:sz w:val="22"/>
-          <w:szCs w:val="22"/>
-        </w:rPr>
-        <w:t>for example &lt;FunctionName  message = “ ccc” /&gt;</w:t>
+        <w:t xml:space="preserve">inside </w:t>
+      </w:r>
+      <w:proofErr w:type="gramStart"/>
+      <w:r>
+        <w:rPr>
+          <w:color w:val="EE0000"/>
+          <w:sz w:val="22"/>
+          <w:szCs w:val="22"/>
+        </w:rPr>
+        <w:t>this props</w:t>
+      </w:r>
+      <w:proofErr w:type="gramEnd"/>
+      <w:r>
+        <w:rPr>
+          <w:color w:val="EE0000"/>
+          <w:sz w:val="22"/>
+          <w:szCs w:val="22"/>
+        </w:rPr>
+        <w:t xml:space="preserve"> will be all the attributes for a function stored</w:t>
+      </w:r>
+    </w:p>
+    <w:p>
+      <w:pPr>
+        <w:rPr>
+          <w:color w:val="EE0000"/>
+          <w:sz w:val="22"/>
+          <w:szCs w:val="22"/>
+        </w:rPr>
+      </w:pPr>
+      <w:r>
+        <w:rPr>
+          <w:color w:val="EE0000"/>
+          <w:sz w:val="22"/>
+          <w:szCs w:val="22"/>
+        </w:rPr>
+        <w:t xml:space="preserve">for </w:t>
+      </w:r>
+      <w:proofErr w:type="gramStart"/>
+      <w:r>
+        <w:rPr>
+          <w:color w:val="EE0000"/>
+          <w:sz w:val="22"/>
+          <w:szCs w:val="22"/>
+        </w:rPr>
+        <w:t>example</w:t>
+      </w:r>
+      <w:proofErr w:type="gramEnd"/>
+      <w:r>
+        <w:rPr>
+          <w:color w:val="EE0000"/>
+          <w:sz w:val="22"/>
+          <w:szCs w:val="22"/>
+        </w:rPr>
+        <w:t xml:space="preserve"> &lt;</w:t>
+      </w:r>
+      <w:proofErr w:type="gramStart"/>
+      <w:r>
+        <w:rPr>
+          <w:color w:val="EE0000"/>
+          <w:sz w:val="22"/>
+          <w:szCs w:val="22"/>
+        </w:rPr>
+        <w:t>FunctionName  message</w:t>
+      </w:r>
+      <w:proofErr w:type="gramEnd"/>
+      <w:r>
+        <w:rPr>
+          <w:color w:val="EE0000"/>
+          <w:sz w:val="22"/>
+          <w:szCs w:val="22"/>
+        </w:rPr>
+        <w:t xml:space="preserve"> = </w:t>
+      </w:r>
+      <w:proofErr w:type="gramStart"/>
+      <w:r>
+        <w:rPr>
+          <w:color w:val="EE0000"/>
+          <w:sz w:val="22"/>
+          <w:szCs w:val="22"/>
+        </w:rPr>
+        <w:t>“ ccc</w:t>
+      </w:r>
+      <w:proofErr w:type="gramEnd"/>
+      <w:r>
+        <w:rPr>
+          <w:color w:val="EE0000"/>
+          <w:sz w:val="22"/>
+          <w:szCs w:val="22"/>
+        </w:rPr>
+        <w:t>” /&gt;</w:t>
       </w:r>
     </w:p>
     <w:p>
@@ -801,6 +1098,7 @@
         <w:lastRenderedPageBreak/>
         <w:t xml:space="preserve">this message can be accessed by just using </w:t>
       </w:r>
+      <w:proofErr w:type="gramStart"/>
       <w:r>
         <w:rPr>
           <w:color w:val="EE0000"/>
@@ -809,6 +1107,7 @@
         </w:rPr>
         <w:t>props.message</w:t>
       </w:r>
+      <w:proofErr w:type="gramEnd"/>
     </w:p>
     <w:p>
       <w:pPr>
@@ -916,24 +1215,78 @@
           <w:sz w:val="22"/>
           <w:szCs w:val="22"/>
         </w:rPr>
-        <w:t>to create an array;  const arr = []</w:t>
-      </w:r>
-    </w:p>
-    <w:p>
-      <w:pPr>
-        <w:rPr>
-          <w:color w:val="000000" w:themeColor="text1"/>
-          <w:sz w:val="22"/>
-          <w:szCs w:val="22"/>
-        </w:rPr>
-      </w:pPr>
-      <w:r>
-        <w:rPr>
-          <w:color w:val="000000" w:themeColor="text1"/>
-          <w:sz w:val="22"/>
-          <w:szCs w:val="22"/>
-        </w:rPr>
-        <w:t>to make it an array of objects, const arr = [{property: , property2: }, {}]</w:t>
+        <w:t xml:space="preserve">to create an </w:t>
+      </w:r>
+      <w:proofErr w:type="gramStart"/>
+      <w:r>
+        <w:rPr>
+          <w:color w:val="000000" w:themeColor="text1"/>
+          <w:sz w:val="22"/>
+          <w:szCs w:val="22"/>
+        </w:rPr>
+        <w:t>array;  const</w:t>
+      </w:r>
+      <w:proofErr w:type="gramEnd"/>
+      <w:r>
+        <w:rPr>
+          <w:color w:val="000000" w:themeColor="text1"/>
+          <w:sz w:val="22"/>
+          <w:szCs w:val="22"/>
+        </w:rPr>
+        <w:t xml:space="preserve"> arr = []</w:t>
+      </w:r>
+    </w:p>
+    <w:p>
+      <w:pPr>
+        <w:rPr>
+          <w:color w:val="000000" w:themeColor="text1"/>
+          <w:sz w:val="22"/>
+          <w:szCs w:val="22"/>
+        </w:rPr>
+      </w:pPr>
+      <w:r>
+        <w:rPr>
+          <w:color w:val="000000" w:themeColor="text1"/>
+          <w:sz w:val="22"/>
+          <w:szCs w:val="22"/>
+        </w:rPr>
+        <w:t>to make it an array of objects, const arr = [{property</w:t>
+      </w:r>
+      <w:proofErr w:type="gramStart"/>
+      <w:r>
+        <w:rPr>
+          <w:color w:val="000000" w:themeColor="text1"/>
+          <w:sz w:val="22"/>
+          <w:szCs w:val="22"/>
+        </w:rPr>
+        <w:t>: ,</w:t>
+      </w:r>
+      <w:proofErr w:type="gramEnd"/>
+      <w:r>
+        <w:rPr>
+          <w:color w:val="000000" w:themeColor="text1"/>
+          <w:sz w:val="22"/>
+          <w:szCs w:val="22"/>
+        </w:rPr>
+        <w:t xml:space="preserve"> property2</w:t>
+      </w:r>
+      <w:proofErr w:type="gramStart"/>
+      <w:r>
+        <w:rPr>
+          <w:color w:val="000000" w:themeColor="text1"/>
+          <w:sz w:val="22"/>
+          <w:szCs w:val="22"/>
+        </w:rPr>
+        <w:t>: }</w:t>
+      </w:r>
+      <w:proofErr w:type="gramEnd"/>
+      <w:r>
+        <w:rPr>
+          <w:color w:val="000000" w:themeColor="text1"/>
+          <w:sz w:val="22"/>
+          <w:szCs w:val="22"/>
+        </w:rPr>
+        <w:t>, {}]</w:t>
       </w:r>
     </w:p>
     <w:p>
@@ -961,13 +1314,23 @@
           <w:szCs w:val="22"/>
         </w:rPr>
       </w:pPr>
-      <w:r>
-        <w:rPr>
-          <w:color w:val="000000" w:themeColor="text1"/>
-          <w:sz w:val="22"/>
-          <w:szCs w:val="22"/>
-        </w:rPr>
-        <w:t xml:space="preserve">instead we store the data into an array of objects, each object holds properties </w:t>
+      <w:proofErr w:type="gramStart"/>
+      <w:r>
+        <w:rPr>
+          <w:color w:val="000000" w:themeColor="text1"/>
+          <w:sz w:val="22"/>
+          <w:szCs w:val="22"/>
+        </w:rPr>
+        <w:t>instead</w:t>
+      </w:r>
+      <w:proofErr w:type="gramEnd"/>
+      <w:r>
+        <w:rPr>
+          <w:color w:val="000000" w:themeColor="text1"/>
+          <w:sz w:val="22"/>
+          <w:szCs w:val="22"/>
+        </w:rPr>
+        <w:t xml:space="preserve"> we store the data into an array of objects, each object holds properties </w:t>
       </w:r>
     </w:p>
     <w:p>
@@ -1010,67 +1373,133 @@
           <w:sz w:val="22"/>
           <w:szCs w:val="22"/>
         </w:rPr>
-        <w:t>we then should take the array, arr.map()</w:t>
-      </w:r>
-    </w:p>
-    <w:p>
-      <w:pPr>
-        <w:rPr>
-          <w:color w:val="000000" w:themeColor="text1"/>
-          <w:sz w:val="22"/>
-          <w:szCs w:val="22"/>
-        </w:rPr>
-      </w:pPr>
-      <w:r>
-        <w:rPr>
-          <w:color w:val="000000" w:themeColor="text1"/>
-          <w:sz w:val="22"/>
-          <w:szCs w:val="22"/>
-        </w:rPr>
-        <w:t>the .map() lets us iterate through each value within the array</w:t>
-      </w:r>
-    </w:p>
-    <w:p>
-      <w:pPr>
-        <w:rPr>
-          <w:color w:val="000000" w:themeColor="text1"/>
-          <w:sz w:val="22"/>
-          <w:szCs w:val="22"/>
-        </w:rPr>
-      </w:pPr>
-      <w:r>
-        <w:rPr>
-          <w:color w:val="000000" w:themeColor="text1"/>
-          <w:sz w:val="22"/>
-          <w:szCs w:val="22"/>
-        </w:rPr>
-        <w:t>arr.map ( (newVariable) =&gt; )</w:t>
-      </w:r>
-    </w:p>
-    <w:p>
-      <w:pPr>
-        <w:rPr>
-          <w:color w:val="000000" w:themeColor="text1"/>
-          <w:sz w:val="22"/>
-          <w:szCs w:val="22"/>
-        </w:rPr>
-      </w:pPr>
-    </w:p>
-    <w:p>
-      <w:pPr>
-        <w:rPr>
-          <w:color w:val="000000" w:themeColor="text1"/>
-          <w:sz w:val="22"/>
-          <w:szCs w:val="22"/>
-        </w:rPr>
-      </w:pPr>
-      <w:r>
-        <w:rPr>
-          <w:color w:val="000000" w:themeColor="text1"/>
-          <w:sz w:val="22"/>
-          <w:szCs w:val="22"/>
-        </w:rPr>
-        <w:t xml:space="preserve">.map() runs through each object inside the array and runs it against the function that we are going to pass to it, </w:t>
+        <w:t xml:space="preserve">we then should take the array, </w:t>
+      </w:r>
+      <w:proofErr w:type="gramStart"/>
+      <w:r>
+        <w:rPr>
+          <w:color w:val="000000" w:themeColor="text1"/>
+          <w:sz w:val="22"/>
+          <w:szCs w:val="22"/>
+        </w:rPr>
+        <w:t>arr.map(</w:t>
+      </w:r>
+      <w:proofErr w:type="gramEnd"/>
+      <w:r>
+        <w:rPr>
+          <w:color w:val="000000" w:themeColor="text1"/>
+          <w:sz w:val="22"/>
+          <w:szCs w:val="22"/>
+        </w:rPr>
+        <w:t>)</w:t>
+      </w:r>
+    </w:p>
+    <w:p>
+      <w:pPr>
+        <w:rPr>
+          <w:color w:val="000000" w:themeColor="text1"/>
+          <w:sz w:val="22"/>
+          <w:szCs w:val="22"/>
+        </w:rPr>
+      </w:pPr>
+      <w:proofErr w:type="gramStart"/>
+      <w:r>
+        <w:rPr>
+          <w:color w:val="000000" w:themeColor="text1"/>
+          <w:sz w:val="22"/>
+          <w:szCs w:val="22"/>
+        </w:rPr>
+        <w:t>the .map</w:t>
+      </w:r>
+      <w:proofErr w:type="gramEnd"/>
+      <w:r>
+        <w:rPr>
+          <w:color w:val="000000" w:themeColor="text1"/>
+          <w:sz w:val="22"/>
+          <w:szCs w:val="22"/>
+        </w:rPr>
+        <w:t>() lets us iterate through each value within the array</w:t>
+      </w:r>
+    </w:p>
+    <w:p>
+      <w:pPr>
+        <w:rPr>
+          <w:color w:val="000000" w:themeColor="text1"/>
+          <w:sz w:val="22"/>
+          <w:szCs w:val="22"/>
+        </w:rPr>
+      </w:pPr>
+      <w:r>
+        <w:rPr>
+          <w:color w:val="000000" w:themeColor="text1"/>
+          <w:sz w:val="22"/>
+          <w:szCs w:val="22"/>
+        </w:rPr>
+        <w:t xml:space="preserve">arr.map </w:t>
+      </w:r>
+      <w:proofErr w:type="gramStart"/>
+      <w:r>
+        <w:rPr>
+          <w:color w:val="000000" w:themeColor="text1"/>
+          <w:sz w:val="22"/>
+          <w:szCs w:val="22"/>
+        </w:rPr>
+        <w:t>( (</w:t>
+      </w:r>
+      <w:proofErr w:type="gramEnd"/>
+      <w:r>
+        <w:rPr>
+          <w:color w:val="000000" w:themeColor="text1"/>
+          <w:sz w:val="22"/>
+          <w:szCs w:val="22"/>
+        </w:rPr>
+        <w:t>newVariable) =</w:t>
+      </w:r>
+      <w:proofErr w:type="gramStart"/>
+      <w:r>
+        <w:rPr>
+          <w:color w:val="000000" w:themeColor="text1"/>
+          <w:sz w:val="22"/>
+          <w:szCs w:val="22"/>
+        </w:rPr>
+        <w:t>&gt; )</w:t>
+      </w:r>
+      <w:proofErr w:type="gramEnd"/>
+    </w:p>
+    <w:p>
+      <w:pPr>
+        <w:rPr>
+          <w:color w:val="000000" w:themeColor="text1"/>
+          <w:sz w:val="22"/>
+          <w:szCs w:val="22"/>
+        </w:rPr>
+      </w:pPr>
+    </w:p>
+    <w:p>
+      <w:pPr>
+        <w:rPr>
+          <w:color w:val="000000" w:themeColor="text1"/>
+          <w:sz w:val="22"/>
+          <w:szCs w:val="22"/>
+        </w:rPr>
+      </w:pPr>
+      <w:proofErr w:type="gramStart"/>
+      <w:r>
+        <w:rPr>
+          <w:color w:val="000000" w:themeColor="text1"/>
+          <w:sz w:val="22"/>
+          <w:szCs w:val="22"/>
+        </w:rPr>
+        <w:t>.map</w:t>
+      </w:r>
+      <w:proofErr w:type="gramEnd"/>
+      <w:r>
+        <w:rPr>
+          <w:color w:val="000000" w:themeColor="text1"/>
+          <w:sz w:val="22"/>
+          <w:szCs w:val="22"/>
+        </w:rPr>
+        <w:t xml:space="preserve">() runs through each object inside the array and runs it against the function that we are going to pass to it, </w:t>
       </w:r>
     </w:p>
     <w:p>
@@ -1156,7 +1585,43 @@
           <w:szCs w:val="22"/>
         </w:rPr>
         <w:br/>
-        <w:t xml:space="preserve">          &lt;ChatMessage message={chatMessage.message} sender={chatMessage.sender} /&gt;</w:t>
+        <w:t xml:space="preserve">          &lt;ChatMessage message</w:t>
+      </w:r>
+      <w:proofErr w:type="gramStart"/>
+      <w:r>
+        <w:rPr>
+          <w:color w:val="EE0000"/>
+          <w:sz w:val="22"/>
+          <w:szCs w:val="22"/>
+        </w:rPr>
+        <w:t>={</w:t>
+      </w:r>
+      <w:proofErr w:type="gramEnd"/>
+      <w:r>
+        <w:rPr>
+          <w:color w:val="EE0000"/>
+          <w:sz w:val="22"/>
+          <w:szCs w:val="22"/>
+        </w:rPr>
+        <w:t>chatMessage.message} sender</w:t>
+      </w:r>
+      <w:proofErr w:type="gramStart"/>
+      <w:r>
+        <w:rPr>
+          <w:color w:val="EE0000"/>
+          <w:sz w:val="22"/>
+          <w:szCs w:val="22"/>
+        </w:rPr>
+        <w:t>={</w:t>
+      </w:r>
+      <w:proofErr w:type="gramEnd"/>
+      <w:r>
+        <w:rPr>
+          <w:color w:val="EE0000"/>
+          <w:sz w:val="22"/>
+          <w:szCs w:val="22"/>
+        </w:rPr>
+        <w:t>chatMessage.sender} /&gt;</w:t>
       </w:r>
       <w:r>
         <w:rPr>
@@ -1382,13 +1847,41 @@
           <w:szCs w:val="22"/>
         </w:rPr>
       </w:pPr>
-      <w:r>
-        <w:rPr>
-          <w:color w:val="000000" w:themeColor="text1"/>
-          <w:sz w:val="22"/>
-          <w:szCs w:val="22"/>
-        </w:rPr>
-        <w:t>lets us run an function when we interact with the website</w:t>
+      <w:proofErr w:type="gramStart"/>
+      <w:r>
+        <w:rPr>
+          <w:color w:val="000000" w:themeColor="text1"/>
+          <w:sz w:val="22"/>
+          <w:szCs w:val="22"/>
+        </w:rPr>
+        <w:t>lets</w:t>
+      </w:r>
+      <w:proofErr w:type="gramEnd"/>
+      <w:r>
+        <w:rPr>
+          <w:color w:val="000000" w:themeColor="text1"/>
+          <w:sz w:val="22"/>
+          <w:szCs w:val="22"/>
+        </w:rPr>
+        <w:t xml:space="preserve"> us run </w:t>
+      </w:r>
+      <w:proofErr w:type="gramStart"/>
+      <w:r>
+        <w:rPr>
+          <w:color w:val="000000" w:themeColor="text1"/>
+          <w:sz w:val="22"/>
+          <w:szCs w:val="22"/>
+        </w:rPr>
+        <w:t>an</w:t>
+      </w:r>
+      <w:proofErr w:type="gramEnd"/>
+      <w:r>
+        <w:rPr>
+          <w:color w:val="000000" w:themeColor="text1"/>
+          <w:sz w:val="22"/>
+          <w:szCs w:val="22"/>
+        </w:rPr>
+        <w:t xml:space="preserve"> function when we interact with the website</w:t>
       </w:r>
     </w:p>
     <w:p>
@@ -1422,7 +1915,25 @@
           <w:sz w:val="22"/>
           <w:szCs w:val="22"/>
         </w:rPr>
-        <w:t>&lt;button onClick={executefunction()}&gt; &lt;/button&gt;</w:t>
+        <w:t>&lt;button onClick={</w:t>
+      </w:r>
+      <w:proofErr w:type="gramStart"/>
+      <w:r>
+        <w:rPr>
+          <w:color w:val="000000" w:themeColor="text1"/>
+          <w:sz w:val="22"/>
+          <w:szCs w:val="22"/>
+        </w:rPr>
+        <w:t>executefunction(</w:t>
+      </w:r>
+      <w:proofErr w:type="gramEnd"/>
+      <w:r>
+        <w:rPr>
+          <w:color w:val="000000" w:themeColor="text1"/>
+          <w:sz w:val="22"/>
+          <w:szCs w:val="22"/>
+        </w:rPr>
+        <w:t>)}&gt; &lt;/button&gt;</w:t>
       </w:r>
     </w:p>
     <w:p>
@@ -1527,7 +2038,25 @@
           <w:sz w:val="22"/>
           <w:szCs w:val="22"/>
         </w:rPr>
-        <w:t>React.useState( here lives the array of objeccts);</w:t>
+        <w:t>React.useState</w:t>
+      </w:r>
+      <w:proofErr w:type="gramStart"/>
+      <w:r>
+        <w:rPr>
+          <w:color w:val="000000" w:themeColor="text1"/>
+          <w:sz w:val="22"/>
+          <w:szCs w:val="22"/>
+        </w:rPr>
+        <w:t>( here</w:t>
+      </w:r>
+      <w:proofErr w:type="gramEnd"/>
+      <w:r>
+        <w:rPr>
+          <w:color w:val="000000" w:themeColor="text1"/>
+          <w:sz w:val="22"/>
+          <w:szCs w:val="22"/>
+        </w:rPr>
+        <w:t xml:space="preserve"> lives the array of objeccts);</w:t>
       </w:r>
     </w:p>
     <w:p>
@@ -1555,13 +2084,23 @@
           <w:szCs w:val="22"/>
         </w:rPr>
       </w:pPr>
-      <w:r>
-        <w:rPr>
-          <w:color w:val="000000" w:themeColor="text1"/>
-          <w:sz w:val="22"/>
-          <w:szCs w:val="22"/>
-        </w:rPr>
-        <w:t>arrayName[0] this will always get us the first message (latest)</w:t>
+      <w:proofErr w:type="gramStart"/>
+      <w:r>
+        <w:rPr>
+          <w:color w:val="000000" w:themeColor="text1"/>
+          <w:sz w:val="22"/>
+          <w:szCs w:val="22"/>
+        </w:rPr>
+        <w:t>arrayName[</w:t>
+      </w:r>
+      <w:proofErr w:type="gramEnd"/>
+      <w:r>
+        <w:rPr>
+          <w:color w:val="000000" w:themeColor="text1"/>
+          <w:sz w:val="22"/>
+          <w:szCs w:val="22"/>
+        </w:rPr>
+        <w:t>0] this will always get us the first message (latest)</w:t>
       </w:r>
     </w:p>
     <w:p>
@@ -1831,7 +2370,25 @@
           <w:sz w:val="22"/>
           <w:szCs w:val="22"/>
         </w:rPr>
-        <w:t>button { background-color: #00ff00;</w:t>
+        <w:t xml:space="preserve">button </w:t>
+      </w:r>
+      <w:proofErr w:type="gramStart"/>
+      <w:r>
+        <w:rPr>
+          <w:color w:val="EE0000"/>
+          <w:sz w:val="22"/>
+          <w:szCs w:val="22"/>
+        </w:rPr>
+        <w:t>{ background</w:t>
+      </w:r>
+      <w:proofErr w:type="gramEnd"/>
+      <w:r>
+        <w:rPr>
+          <w:color w:val="EE0000"/>
+          <w:sz w:val="22"/>
+          <w:szCs w:val="22"/>
+        </w:rPr>
+        <w:t>-color: #00ff00;</w:t>
       </w:r>
     </w:p>
     <w:p>
@@ -1865,7 +2422,16 @@
           <w:sz w:val="22"/>
           <w:szCs w:val="22"/>
         </w:rPr>
-        <w:t xml:space="preserve"> this is for the text itself</w:t>
+        <w:t xml:space="preserve"> this is for the text </w:t>
+      </w:r>
+      <w:proofErr w:type="gramStart"/>
+      <w:r>
+        <w:rPr>
+          <w:color w:val="000000" w:themeColor="text1"/>
+          <w:sz w:val="22"/>
+          <w:szCs w:val="22"/>
+        </w:rPr>
+        <w:t>itself</w:t>
       </w:r>
       <w:r>
         <w:rPr>
@@ -1875,6 +2441,7 @@
         </w:rPr>
         <w:t xml:space="preserve"> }</w:t>
       </w:r>
+      <w:proofErr w:type="gramEnd"/>
       <w:r>
         <w:rPr>
           <w:color w:val="000000" w:themeColor="text1"/>
@@ -1906,8 +2473,54 @@
           <w:sz w:val="22"/>
           <w:szCs w:val="22"/>
         </w:rPr>
-        <w:t>button { background-color: rgb(0, 255, 0); }</w:t>
-      </w:r>
+        <w:t xml:space="preserve">button </w:t>
+      </w:r>
+      <w:proofErr w:type="gramStart"/>
+      <w:r>
+        <w:rPr>
+          <w:color w:val="EE0000"/>
+          <w:sz w:val="22"/>
+          <w:szCs w:val="22"/>
+        </w:rPr>
+        <w:t>{ background</w:t>
+      </w:r>
+      <w:proofErr w:type="gramEnd"/>
+      <w:r>
+        <w:rPr>
+          <w:color w:val="EE0000"/>
+          <w:sz w:val="22"/>
+          <w:szCs w:val="22"/>
+        </w:rPr>
+        <w:t xml:space="preserve">-color: </w:t>
+      </w:r>
+      <w:proofErr w:type="gramStart"/>
+      <w:r>
+        <w:rPr>
+          <w:color w:val="EE0000"/>
+          <w:sz w:val="22"/>
+          <w:szCs w:val="22"/>
+        </w:rPr>
+        <w:t>rgb(</w:t>
+      </w:r>
+      <w:proofErr w:type="gramEnd"/>
+      <w:r>
+        <w:rPr>
+          <w:color w:val="EE0000"/>
+          <w:sz w:val="22"/>
+          <w:szCs w:val="22"/>
+        </w:rPr>
+        <w:t>0, 255, 0)</w:t>
+      </w:r>
+      <w:proofErr w:type="gramStart"/>
+      <w:r>
+        <w:rPr>
+          <w:color w:val="EE0000"/>
+          <w:sz w:val="22"/>
+          <w:szCs w:val="22"/>
+        </w:rPr>
+        <w:t>; }</w:t>
+      </w:r>
+      <w:proofErr w:type="gramEnd"/>
       <w:r>
         <w:rPr>
           <w:color w:val="000000" w:themeColor="text1"/>
@@ -1931,8 +2544,36 @@
           <w:sz w:val="22"/>
           <w:szCs w:val="22"/>
         </w:rPr>
-        <w:t>button { background-color: darkgreen; }</w:t>
-      </w:r>
+        <w:t xml:space="preserve">button </w:t>
+      </w:r>
+      <w:proofErr w:type="gramStart"/>
+      <w:r>
+        <w:rPr>
+          <w:color w:val="EE0000"/>
+          <w:sz w:val="22"/>
+          <w:szCs w:val="22"/>
+        </w:rPr>
+        <w:t>{ background</w:t>
+      </w:r>
+      <w:proofErr w:type="gramEnd"/>
+      <w:r>
+        <w:rPr>
+          <w:color w:val="EE0000"/>
+          <w:sz w:val="22"/>
+          <w:szCs w:val="22"/>
+        </w:rPr>
+        <w:t>-color: darkgreen</w:t>
+      </w:r>
+      <w:proofErr w:type="gramStart"/>
+      <w:r>
+        <w:rPr>
+          <w:color w:val="EE0000"/>
+          <w:sz w:val="22"/>
+          <w:szCs w:val="22"/>
+        </w:rPr>
+        <w:t>; }</w:t>
+      </w:r>
+      <w:proofErr w:type="gramEnd"/>
       <w:r>
         <w:rPr>
           <w:color w:val="000000" w:themeColor="text1"/>
@@ -1976,14 +2617,52 @@
           <w:szCs w:val="22"/>
         </w:rPr>
       </w:pPr>
-      <w:r>
-        <w:rPr>
-          <w:color w:val="EE0000"/>
-          <w:sz w:val="22"/>
-          <w:szCs w:val="22"/>
-        </w:rPr>
-        <w:t>.primary-button { background-color: green; }</w:t>
-      </w:r>
+      <w:proofErr w:type="gramStart"/>
+      <w:r>
+        <w:rPr>
+          <w:color w:val="EE0000"/>
+          <w:sz w:val="22"/>
+          <w:szCs w:val="22"/>
+        </w:rPr>
+        <w:t>.primary</w:t>
+      </w:r>
+      <w:proofErr w:type="gramEnd"/>
+      <w:r>
+        <w:rPr>
+          <w:color w:val="EE0000"/>
+          <w:sz w:val="22"/>
+          <w:szCs w:val="22"/>
+        </w:rPr>
+        <w:t xml:space="preserve">-button </w:t>
+      </w:r>
+      <w:proofErr w:type="gramStart"/>
+      <w:r>
+        <w:rPr>
+          <w:color w:val="EE0000"/>
+          <w:sz w:val="22"/>
+          <w:szCs w:val="22"/>
+        </w:rPr>
+        <w:t>{ background</w:t>
+      </w:r>
+      <w:proofErr w:type="gramEnd"/>
+      <w:r>
+        <w:rPr>
+          <w:color w:val="EE0000"/>
+          <w:sz w:val="22"/>
+          <w:szCs w:val="22"/>
+        </w:rPr>
+        <w:t>-color: green</w:t>
+      </w:r>
+      <w:proofErr w:type="gramStart"/>
+      <w:r>
+        <w:rPr>
+          <w:color w:val="EE0000"/>
+          <w:sz w:val="22"/>
+          <w:szCs w:val="22"/>
+        </w:rPr>
+        <w:t>; }</w:t>
+      </w:r>
+      <w:proofErr w:type="gramEnd"/>
       <w:r>
         <w:rPr>
           <w:color w:val="000000" w:themeColor="text1"/>
@@ -2007,8 +2686,54 @@
           <w:sz w:val="22"/>
           <w:szCs w:val="22"/>
         </w:rPr>
-        <w:t>#submit-btn { background-color: green; }</w:t>
-      </w:r>
+        <w:t>#</w:t>
+      </w:r>
+      <w:proofErr w:type="gramStart"/>
+      <w:r>
+        <w:rPr>
+          <w:color w:val="EE0000"/>
+          <w:sz w:val="22"/>
+          <w:szCs w:val="22"/>
+        </w:rPr>
+        <w:t>submit</w:t>
+      </w:r>
+      <w:proofErr w:type="gramEnd"/>
+      <w:r>
+        <w:rPr>
+          <w:color w:val="EE0000"/>
+          <w:sz w:val="22"/>
+          <w:szCs w:val="22"/>
+        </w:rPr>
+        <w:t xml:space="preserve">-btn </w:t>
+      </w:r>
+      <w:proofErr w:type="gramStart"/>
+      <w:r>
+        <w:rPr>
+          <w:color w:val="EE0000"/>
+          <w:sz w:val="22"/>
+          <w:szCs w:val="22"/>
+        </w:rPr>
+        <w:t>{ background</w:t>
+      </w:r>
+      <w:proofErr w:type="gramEnd"/>
+      <w:r>
+        <w:rPr>
+          <w:color w:val="EE0000"/>
+          <w:sz w:val="22"/>
+          <w:szCs w:val="22"/>
+        </w:rPr>
+        <w:t>-color: green</w:t>
+      </w:r>
+      <w:proofErr w:type="gramStart"/>
+      <w:r>
+        <w:rPr>
+          <w:color w:val="EE0000"/>
+          <w:sz w:val="22"/>
+          <w:szCs w:val="22"/>
+        </w:rPr>
+        <w:t>; }</w:t>
+      </w:r>
+      <w:proofErr w:type="gramEnd"/>
       <w:r>
         <w:rPr>
           <w:color w:val="000000" w:themeColor="text1"/>
@@ -2032,7 +2757,43 @@
           <w:sz w:val="22"/>
           <w:szCs w:val="22"/>
         </w:rPr>
-        <w:t xml:space="preserve">form button { background-color: green; }  </w:t>
+        <w:t xml:space="preserve">form button </w:t>
+      </w:r>
+      <w:proofErr w:type="gramStart"/>
+      <w:r>
+        <w:rPr>
+          <w:color w:val="EE0000"/>
+          <w:sz w:val="22"/>
+          <w:szCs w:val="22"/>
+        </w:rPr>
+        <w:t>{ background</w:t>
+      </w:r>
+      <w:proofErr w:type="gramEnd"/>
+      <w:r>
+        <w:rPr>
+          <w:color w:val="EE0000"/>
+          <w:sz w:val="22"/>
+          <w:szCs w:val="22"/>
+        </w:rPr>
+        <w:t>-color: green</w:t>
+      </w:r>
+      <w:proofErr w:type="gramStart"/>
+      <w:r>
+        <w:rPr>
+          <w:color w:val="EE0000"/>
+          <w:sz w:val="22"/>
+          <w:szCs w:val="22"/>
+        </w:rPr>
+        <w:t>; }</w:t>
+      </w:r>
+      <w:proofErr w:type="gramEnd"/>
+      <w:r>
+        <w:rPr>
+          <w:color w:val="EE0000"/>
+          <w:sz w:val="22"/>
+          <w:szCs w:val="22"/>
+        </w:rPr>
+        <w:t xml:space="preserve">  </w:t>
       </w:r>
       <w:r>
         <w:rPr>
@@ -2095,41 +2856,71 @@
           <w:sz w:val="22"/>
           <w:szCs w:val="22"/>
         </w:rPr>
-        <w:t xml:space="preserve">padding: 12 20; </w:t>
-      </w:r>
-      <w:r>
-        <w:rPr>
-          <w:color w:val="000000" w:themeColor="text1"/>
-          <w:sz w:val="22"/>
-          <w:szCs w:val="22"/>
-        </w:rPr>
-        <w:t xml:space="preserve"> the 12 represents the vertical padding the second represents the horizontal padding</w:t>
-      </w:r>
-    </w:p>
-    <w:p>
-      <w:pPr>
-        <w:rPr>
-          <w:color w:val="000000" w:themeColor="text1"/>
-          <w:sz w:val="22"/>
-          <w:szCs w:val="22"/>
-        </w:rPr>
-      </w:pPr>
-    </w:p>
-    <w:p>
-      <w:pPr>
-        <w:rPr>
-          <w:color w:val="000000" w:themeColor="text1"/>
-          <w:sz w:val="22"/>
-          <w:szCs w:val="22"/>
-        </w:rPr>
-      </w:pPr>
-      <w:r>
-        <w:rPr>
-          <w:color w:val="000000" w:themeColor="text1"/>
-          <w:sz w:val="22"/>
-          <w:szCs w:val="22"/>
-        </w:rPr>
-        <w:t>.send-button {</w:t>
+        <w:t xml:space="preserve">padding: 12 </w:t>
+      </w:r>
+      <w:proofErr w:type="gramStart"/>
+      <w:r>
+        <w:rPr>
+          <w:b/>
+          <w:bCs/>
+          <w:color w:val="000000" w:themeColor="text1"/>
+          <w:sz w:val="22"/>
+          <w:szCs w:val="22"/>
+        </w:rPr>
+        <w:t xml:space="preserve">20; </w:t>
+      </w:r>
+      <w:r>
+        <w:rPr>
+          <w:color w:val="000000" w:themeColor="text1"/>
+          <w:sz w:val="22"/>
+          <w:szCs w:val="22"/>
+        </w:rPr>
+        <w:t xml:space="preserve"> the</w:t>
+      </w:r>
+      <w:proofErr w:type="gramEnd"/>
+      <w:r>
+        <w:rPr>
+          <w:color w:val="000000" w:themeColor="text1"/>
+          <w:sz w:val="22"/>
+          <w:szCs w:val="22"/>
+        </w:rPr>
+        <w:t xml:space="preserve"> 12 represents the vertical padding the second represents the horizontal padding</w:t>
+      </w:r>
+    </w:p>
+    <w:p>
+      <w:pPr>
+        <w:rPr>
+          <w:color w:val="000000" w:themeColor="text1"/>
+          <w:sz w:val="22"/>
+          <w:szCs w:val="22"/>
+        </w:rPr>
+      </w:pPr>
+    </w:p>
+    <w:p>
+      <w:pPr>
+        <w:rPr>
+          <w:color w:val="000000" w:themeColor="text1"/>
+          <w:sz w:val="22"/>
+          <w:szCs w:val="22"/>
+        </w:rPr>
+      </w:pPr>
+      <w:proofErr w:type="gramStart"/>
+      <w:r>
+        <w:rPr>
+          <w:color w:val="000000" w:themeColor="text1"/>
+          <w:sz w:val="22"/>
+          <w:szCs w:val="22"/>
+        </w:rPr>
+        <w:t>.send</w:t>
+      </w:r>
+      <w:proofErr w:type="gramEnd"/>
+      <w:r>
+        <w:rPr>
+          <w:color w:val="000000" w:themeColor="text1"/>
+          <w:sz w:val="22"/>
+          <w:szCs w:val="22"/>
+        </w:rPr>
+        <w:t>-button {</w:t>
       </w:r>
       <w:r>
         <w:rPr>
@@ -2384,6 +3175,679 @@
           <w:szCs w:val="22"/>
         </w:rPr>
         <w:t>React.userRef()</w:t>
+      </w:r>
+    </w:p>
+    <w:p>
+      <w:pPr>
+        <w:rPr>
+          <w:color w:val="000000" w:themeColor="text1"/>
+          <w:sz w:val="22"/>
+          <w:szCs w:val="22"/>
+        </w:rPr>
+      </w:pPr>
+    </w:p>
+    <w:p>
+      <w:pPr>
+        <w:rPr>
+          <w:color w:val="000000" w:themeColor="text1"/>
+          <w:sz w:val="22"/>
+          <w:szCs w:val="22"/>
+        </w:rPr>
+      </w:pPr>
+    </w:p>
+    <w:p>
+      <w:pPr>
+        <w:jc w:val="center"/>
+        <w:rPr>
+          <w:b/>
+          <w:bCs/>
+          <w:color w:val="000000" w:themeColor="text1"/>
+          <w:sz w:val="28"/>
+          <w:szCs w:val="28"/>
+          <w:u w:val="single"/>
+        </w:rPr>
+      </w:pPr>
+      <w:r>
+        <w:rPr>
+          <w:b/>
+          <w:bCs/>
+          <w:color w:val="000000" w:themeColor="text1"/>
+          <w:sz w:val="28"/>
+          <w:szCs w:val="28"/>
+          <w:u w:val="single"/>
+        </w:rPr>
+        <w:lastRenderedPageBreak/>
+        <w:t>Lesson 5</w:t>
+      </w:r>
+    </w:p>
+    <w:p>
+      <w:pPr>
+        <w:rPr>
+          <w:color w:val="000000" w:themeColor="text1"/>
+          <w:sz w:val="22"/>
+          <w:szCs w:val="22"/>
+        </w:rPr>
+      </w:pPr>
+      <w:r>
+        <w:rPr>
+          <w:color w:val="000000" w:themeColor="text1"/>
+          <w:sz w:val="22"/>
+          <w:szCs w:val="22"/>
+        </w:rPr>
+        <w:t>the node command lets us run javascript code outside of the browser</w:t>
+      </w:r>
+    </w:p>
+    <w:p>
+      <w:pPr>
+        <w:rPr>
+          <w:color w:val="000000" w:themeColor="text1"/>
+          <w:sz w:val="22"/>
+          <w:szCs w:val="22"/>
+        </w:rPr>
+      </w:pPr>
+      <w:r>
+        <w:rPr>
+          <w:color w:val="000000" w:themeColor="text1"/>
+          <w:sz w:val="22"/>
+          <w:szCs w:val="22"/>
+        </w:rPr>
+        <w:t>npm = node package manager</w:t>
+      </w:r>
+    </w:p>
+    <w:p>
+      <w:pPr>
+        <w:rPr>
+          <w:color w:val="000000" w:themeColor="text1"/>
+          <w:sz w:val="22"/>
+          <w:szCs w:val="22"/>
+        </w:rPr>
+      </w:pPr>
+      <w:r>
+        <w:rPr>
+          <w:color w:val="000000" w:themeColor="text1"/>
+          <w:sz w:val="22"/>
+          <w:szCs w:val="22"/>
+        </w:rPr>
+        <w:t>each time we use npm install + library name we add a new library and this library adds a new command to our command line</w:t>
+      </w:r>
+    </w:p>
+    <w:p>
+      <w:pPr>
+        <w:rPr>
+          <w:color w:val="000000" w:themeColor="text1"/>
+          <w:sz w:val="22"/>
+          <w:szCs w:val="22"/>
+        </w:rPr>
+      </w:pPr>
+      <w:r>
+        <w:rPr>
+          <w:color w:val="000000" w:themeColor="text1"/>
+          <w:sz w:val="22"/>
+          <w:szCs w:val="22"/>
+        </w:rPr>
+        <w:t xml:space="preserve">npx = installs and executes a new library npx </w:t>
+      </w:r>
+      <w:hyperlink r:id="rId4" w:history="1">
+        <w:r>
+          <w:rPr>
+            <w:rStyle w:val="Hyperlink"/>
+            <w:sz w:val="22"/>
+            <w:szCs w:val="22"/>
+          </w:rPr>
+          <w:t>create-vite@6.0.1</w:t>
+        </w:r>
+      </w:hyperlink>
+    </w:p>
+    <w:p>
+      <w:pPr>
+        <w:rPr>
+          <w:color w:val="000000" w:themeColor="text1"/>
+          <w:sz w:val="22"/>
+          <w:szCs w:val="22"/>
+        </w:rPr>
+      </w:pPr>
+      <w:r>
+        <w:rPr>
+          <w:color w:val="000000" w:themeColor="text1"/>
+          <w:sz w:val="22"/>
+          <w:szCs w:val="22"/>
+        </w:rPr>
+        <w:t xml:space="preserve">npm start dev </w:t>
+      </w:r>
+      <w:r>
+        <w:rPr>
+          <w:color w:val="000000" w:themeColor="text1"/>
+          <w:sz w:val="22"/>
+          <w:szCs w:val="22"/>
+        </w:rPr>
+        <w:sym w:font="Wingdings" w:char="F0E0"/>
+      </w:r>
+      <w:r>
+        <w:rPr>
+          <w:color w:val="000000" w:themeColor="text1"/>
+          <w:sz w:val="22"/>
+          <w:szCs w:val="22"/>
+        </w:rPr>
+        <w:t xml:space="preserve"> this will run a react project</w:t>
+      </w:r>
+    </w:p>
+    <w:p>
+      <w:pPr>
+        <w:rPr>
+          <w:color w:val="000000" w:themeColor="text1"/>
+          <w:sz w:val="22"/>
+          <w:szCs w:val="22"/>
+        </w:rPr>
+      </w:pPr>
+    </w:p>
+    <w:p>
+      <w:pPr>
+        <w:rPr>
+          <w:color w:val="000000" w:themeColor="text1"/>
+          <w:sz w:val="22"/>
+          <w:szCs w:val="22"/>
+        </w:rPr>
+      </w:pPr>
+      <w:r>
+        <w:rPr>
+          <w:color w:val="000000" w:themeColor="text1"/>
+          <w:sz w:val="22"/>
+          <w:szCs w:val="22"/>
+        </w:rPr>
+        <w:t>node module is where the npm installs the packages</w:t>
+      </w:r>
+    </w:p>
+    <w:p>
+      <w:pPr>
+        <w:rPr>
+          <w:color w:val="000000" w:themeColor="text1"/>
+          <w:sz w:val="22"/>
+          <w:szCs w:val="22"/>
+        </w:rPr>
+      </w:pPr>
+      <w:r>
+        <w:rPr>
+          <w:color w:val="000000" w:themeColor="text1"/>
+          <w:sz w:val="22"/>
+          <w:szCs w:val="22"/>
+        </w:rPr>
+        <w:t xml:space="preserve">the src contains the code for our website, however the js files end </w:t>
+      </w:r>
+      <w:proofErr w:type="gramStart"/>
+      <w:r>
+        <w:rPr>
+          <w:color w:val="000000" w:themeColor="text1"/>
+          <w:sz w:val="22"/>
+          <w:szCs w:val="22"/>
+        </w:rPr>
+        <w:t>with .jsx</w:t>
+      </w:r>
+      <w:proofErr w:type="gramEnd"/>
+      <w:r>
+        <w:rPr>
+          <w:color w:val="000000" w:themeColor="text1"/>
+          <w:sz w:val="22"/>
+          <w:szCs w:val="22"/>
+        </w:rPr>
+        <w:t xml:space="preserve"> instead of .js since we write JSX not .js</w:t>
+      </w:r>
+    </w:p>
+    <w:p>
+      <w:pPr>
+        <w:rPr>
+          <w:color w:val="000000" w:themeColor="text1"/>
+          <w:sz w:val="22"/>
+          <w:szCs w:val="22"/>
+        </w:rPr>
+      </w:pPr>
+      <w:r>
+        <w:rPr>
+          <w:color w:val="000000" w:themeColor="text1"/>
+          <w:sz w:val="22"/>
+          <w:szCs w:val="22"/>
+        </w:rPr>
+        <w:t>public means the assets that the public have access to and can download or get a link for</w:t>
+      </w:r>
+    </w:p>
+    <w:p>
+      <w:pPr>
+        <w:rPr>
+          <w:color w:val="000000" w:themeColor="text1"/>
+          <w:sz w:val="22"/>
+          <w:szCs w:val="22"/>
+        </w:rPr>
+      </w:pPr>
+      <w:r>
+        <w:rPr>
+          <w:color w:val="000000" w:themeColor="text1"/>
+          <w:sz w:val="22"/>
+          <w:szCs w:val="22"/>
+        </w:rPr>
+        <w:t xml:space="preserve"> </w:t>
+      </w:r>
+      <w:r>
+        <w:rPr>
+          <w:color w:val="000000" w:themeColor="text1"/>
+          <w:sz w:val="22"/>
+          <w:szCs w:val="22"/>
+        </w:rPr>
+        <w:t>eslint-config.js is a tool of eslint that highlights problems with our code</w:t>
+      </w:r>
+      <w:r>
+        <w:rPr>
+          <w:color w:val="000000" w:themeColor="text1"/>
+          <w:sz w:val="22"/>
+          <w:szCs w:val="22"/>
+        </w:rPr>
+        <w:t>, to use eslint we need to install the eslint extension.</w:t>
+      </w:r>
+    </w:p>
+    <w:p>
+      <w:pPr>
+        <w:rPr>
+          <w:color w:val="000000" w:themeColor="text1"/>
+          <w:sz w:val="22"/>
+          <w:szCs w:val="22"/>
+        </w:rPr>
+      </w:pPr>
+      <w:r>
+        <w:rPr>
+          <w:color w:val="000000" w:themeColor="text1"/>
+          <w:sz w:val="22"/>
+          <w:szCs w:val="22"/>
+        </w:rPr>
+        <w:t>best practice when using node.js with react is to load external libraries from node_modules instead of using a script tag</w:t>
+      </w:r>
+    </w:p>
+    <w:p>
+      <w:pPr>
+        <w:rPr>
+          <w:color w:val="000000" w:themeColor="text1"/>
+          <w:sz w:val="22"/>
+          <w:szCs w:val="22"/>
+        </w:rPr>
+      </w:pPr>
+      <w:r>
+        <w:rPr>
+          <w:color w:val="000000" w:themeColor="text1"/>
+          <w:sz w:val="22"/>
+          <w:szCs w:val="22"/>
+        </w:rPr>
+        <w:t>we can also import only a function from a node_module instead of loading an entire class</w:t>
+      </w:r>
+    </w:p>
+    <w:p>
+      <w:pPr>
+        <w:rPr>
+          <w:color w:val="000000" w:themeColor="text1"/>
+          <w:sz w:val="22"/>
+          <w:szCs w:val="22"/>
+        </w:rPr>
+      </w:pPr>
+      <w:r>
+        <w:rPr>
+          <w:color w:val="000000" w:themeColor="text1"/>
+          <w:sz w:val="22"/>
+          <w:szCs w:val="22"/>
+        </w:rPr>
+        <w:t>or an entire module for example we can import {useState} from’react’ instead of import {React} from ‘react’</w:t>
+      </w:r>
+    </w:p>
+    <w:p>
+      <w:pPr>
+        <w:rPr>
+          <w:color w:val="000000" w:themeColor="text1"/>
+          <w:sz w:val="22"/>
+          <w:szCs w:val="22"/>
+        </w:rPr>
+      </w:pPr>
+    </w:p>
+    <w:p>
+      <w:pPr>
+        <w:rPr>
+          <w:color w:val="000000" w:themeColor="text1"/>
+          <w:sz w:val="22"/>
+          <w:szCs w:val="22"/>
+        </w:rPr>
+      </w:pPr>
+      <w:r>
+        <w:rPr>
+          <w:color w:val="000000" w:themeColor="text1"/>
+          <w:sz w:val="22"/>
+          <w:szCs w:val="22"/>
+        </w:rPr>
+        <w:t>validation in props in eslint might and will give us an error however we can totally ignore that error by turning it off</w:t>
+      </w:r>
+    </w:p>
+    <w:p>
+      <w:pPr>
+        <w:rPr>
+          <w:color w:val="000000" w:themeColor="text1"/>
+          <w:sz w:val="22"/>
+          <w:szCs w:val="22"/>
+        </w:rPr>
+      </w:pPr>
+      <w:r>
+        <w:rPr>
+          <w:color w:val="000000" w:themeColor="text1"/>
+          <w:sz w:val="22"/>
+          <w:szCs w:val="22"/>
+        </w:rPr>
+        <w:t>vite lets us import any type of file</w:t>
+      </w:r>
+    </w:p>
+    <w:p>
+      <w:pPr>
+        <w:rPr>
+          <w:color w:val="000000" w:themeColor="text1"/>
+          <w:sz w:val="22"/>
+          <w:szCs w:val="22"/>
+        </w:rPr>
+      </w:pPr>
+    </w:p>
+    <w:p>
+      <w:pPr>
+        <w:rPr>
+          <w:color w:val="000000" w:themeColor="text1"/>
+          <w:sz w:val="22"/>
+          <w:szCs w:val="22"/>
+        </w:rPr>
+      </w:pPr>
+      <w:r>
+        <w:rPr>
+          <w:color w:val="000000" w:themeColor="text1"/>
+          <w:sz w:val="22"/>
+          <w:szCs w:val="22"/>
+        </w:rPr>
+        <w:t>app.css includes the styling of the app</w:t>
+      </w:r>
+    </w:p>
+    <w:p>
+      <w:pPr>
+        <w:rPr>
+          <w:color w:val="000000" w:themeColor="text1"/>
+          <w:sz w:val="22"/>
+          <w:szCs w:val="22"/>
+        </w:rPr>
+      </w:pPr>
+      <w:r>
+        <w:rPr>
+          <w:color w:val="000000" w:themeColor="text1"/>
+          <w:sz w:val="22"/>
+          <w:szCs w:val="22"/>
+        </w:rPr>
+        <w:t>while index.css includes the overall look of the website</w:t>
+      </w:r>
+    </w:p>
+    <w:p>
+      <w:pPr>
+        <w:rPr>
+          <w:color w:val="000000" w:themeColor="text1"/>
+          <w:sz w:val="22"/>
+          <w:szCs w:val="22"/>
+        </w:rPr>
+      </w:pPr>
+      <w:r>
+        <w:rPr>
+          <w:color w:val="000000" w:themeColor="text1"/>
+          <w:sz w:val="22"/>
+          <w:szCs w:val="22"/>
+        </w:rPr>
+        <w:t xml:space="preserve">when we import an </w:t>
+      </w:r>
+      <w:proofErr w:type="gramStart"/>
+      <w:r>
+        <w:rPr>
+          <w:color w:val="000000" w:themeColor="text1"/>
+          <w:sz w:val="22"/>
+          <w:szCs w:val="22"/>
+        </w:rPr>
+        <w:t>image</w:t>
+      </w:r>
+      <w:proofErr w:type="gramEnd"/>
+      <w:r>
+        <w:rPr>
+          <w:color w:val="000000" w:themeColor="text1"/>
+          <w:sz w:val="22"/>
+          <w:szCs w:val="22"/>
+        </w:rPr>
+        <w:t xml:space="preserve"> we give it a name without a bracket for variable</w:t>
+      </w:r>
+    </w:p>
+    <w:p>
+      <w:pPr>
+        <w:rPr>
+          <w:color w:val="000000" w:themeColor="text1"/>
+          <w:sz w:val="22"/>
+          <w:szCs w:val="22"/>
+        </w:rPr>
+      </w:pPr>
+      <w:r>
+        <w:rPr>
+          <w:color w:val="000000" w:themeColor="text1"/>
+          <w:sz w:val="22"/>
+          <w:szCs w:val="22"/>
+        </w:rPr>
+        <w:t>a good practice is to separate each component into its own file</w:t>
+      </w:r>
+    </w:p>
+    <w:p>
+      <w:pPr>
+        <w:rPr>
+          <w:color w:val="000000" w:themeColor="text1"/>
+          <w:sz w:val="22"/>
+          <w:szCs w:val="22"/>
+        </w:rPr>
+      </w:pPr>
+      <w:r>
+        <w:rPr>
+          <w:color w:val="000000" w:themeColor="text1"/>
+          <w:sz w:val="22"/>
+          <w:szCs w:val="22"/>
+        </w:rPr>
+        <w:t xml:space="preserve">after separating the inputs what we can do is export each </w:t>
+      </w:r>
+      <w:proofErr w:type="gramStart"/>
+      <w:r>
+        <w:rPr>
+          <w:color w:val="000000" w:themeColor="text1"/>
+          <w:sz w:val="22"/>
+          <w:szCs w:val="22"/>
+        </w:rPr>
+        <w:t>components</w:t>
+      </w:r>
+      <w:proofErr w:type="gramEnd"/>
+      <w:r>
+        <w:rPr>
+          <w:color w:val="000000" w:themeColor="text1"/>
+          <w:sz w:val="22"/>
+          <w:szCs w:val="22"/>
+        </w:rPr>
+        <w:t xml:space="preserve"> and import it or use it in the application that will be rendered</w:t>
+      </w:r>
+    </w:p>
+    <w:p>
+      <w:pPr>
+        <w:rPr>
+          <w:color w:val="000000" w:themeColor="text1"/>
+          <w:sz w:val="22"/>
+          <w:szCs w:val="22"/>
+        </w:rPr>
+      </w:pPr>
+      <w:r>
+        <w:rPr>
+          <w:color w:val="000000" w:themeColor="text1"/>
+          <w:sz w:val="22"/>
+          <w:szCs w:val="22"/>
+        </w:rPr>
+        <w:lastRenderedPageBreak/>
+        <w:t xml:space="preserve">export default </w:t>
+      </w:r>
+      <w:proofErr w:type="gramStart"/>
+      <w:r>
+        <w:rPr>
+          <w:color w:val="000000" w:themeColor="text1"/>
+          <w:sz w:val="22"/>
+          <w:szCs w:val="22"/>
+        </w:rPr>
+        <w:t>functionName(</w:t>
+      </w:r>
+      <w:proofErr w:type="gramEnd"/>
+      <w:r>
+        <w:rPr>
+          <w:color w:val="000000" w:themeColor="text1"/>
+          <w:sz w:val="22"/>
+          <w:szCs w:val="22"/>
+        </w:rPr>
+        <w:t xml:space="preserve">); </w:t>
+      </w:r>
+      <w:r>
+        <w:rPr>
+          <w:color w:val="000000" w:themeColor="text1"/>
+          <w:sz w:val="22"/>
+          <w:szCs w:val="22"/>
+        </w:rPr>
+        <w:sym w:font="Wingdings" w:char="F0E0"/>
+      </w:r>
+      <w:r>
+        <w:rPr>
+          <w:color w:val="000000" w:themeColor="text1"/>
+          <w:sz w:val="22"/>
+          <w:szCs w:val="22"/>
+        </w:rPr>
+        <w:t xml:space="preserve"> is used to export a certain component at the end of a certain file</w:t>
+      </w:r>
+    </w:p>
+    <w:p>
+      <w:pPr>
+        <w:rPr>
+          <w:color w:val="000000" w:themeColor="text1"/>
+          <w:sz w:val="22"/>
+          <w:szCs w:val="22"/>
+        </w:rPr>
+      </w:pPr>
+      <w:r>
+        <w:rPr>
+          <w:color w:val="000000" w:themeColor="text1"/>
+          <w:sz w:val="22"/>
+          <w:szCs w:val="22"/>
+        </w:rPr>
+        <w:t xml:space="preserve">to import this default </w:t>
+      </w:r>
+      <w:proofErr w:type="gramStart"/>
+      <w:r>
+        <w:rPr>
+          <w:color w:val="000000" w:themeColor="text1"/>
+          <w:sz w:val="22"/>
+          <w:szCs w:val="22"/>
+        </w:rPr>
+        <w:t>export</w:t>
+      </w:r>
+      <w:proofErr w:type="gramEnd"/>
+      <w:r>
+        <w:rPr>
+          <w:color w:val="000000" w:themeColor="text1"/>
+          <w:sz w:val="22"/>
+          <w:szCs w:val="22"/>
+        </w:rPr>
+        <w:t xml:space="preserve"> we use import + name directly without curly brackets</w:t>
+      </w:r>
+    </w:p>
+    <w:p>
+      <w:pPr>
+        <w:rPr>
+          <w:color w:val="000000" w:themeColor="text1"/>
+          <w:sz w:val="22"/>
+          <w:szCs w:val="22"/>
+        </w:rPr>
+      </w:pPr>
+      <w:r>
+        <w:rPr>
+          <w:color w:val="000000" w:themeColor="text1"/>
+          <w:sz w:val="22"/>
+          <w:szCs w:val="22"/>
+        </w:rPr>
+        <w:t xml:space="preserve">we should also separate the css into component css. </w:t>
+      </w:r>
+      <w:proofErr w:type="gramStart"/>
+      <w:r>
+        <w:rPr>
+          <w:color w:val="000000" w:themeColor="text1"/>
+          <w:sz w:val="22"/>
+          <w:szCs w:val="22"/>
+        </w:rPr>
+        <w:t>so</w:t>
+      </w:r>
+      <w:proofErr w:type="gramEnd"/>
+      <w:r>
+        <w:rPr>
+          <w:color w:val="000000" w:themeColor="text1"/>
+          <w:sz w:val="22"/>
+          <w:szCs w:val="22"/>
+        </w:rPr>
+        <w:t xml:space="preserve"> for each component we create a .css file that holds componet’s specific css and import it </w:t>
+      </w:r>
+    </w:p>
+    <w:p>
+      <w:pPr>
+        <w:rPr>
+          <w:color w:val="000000" w:themeColor="text1"/>
+          <w:sz w:val="22"/>
+          <w:szCs w:val="22"/>
+        </w:rPr>
+      </w:pPr>
+      <w:proofErr w:type="gramStart"/>
+      <w:r>
+        <w:rPr>
+          <w:color w:val="000000" w:themeColor="text1"/>
+          <w:sz w:val="22"/>
+          <w:szCs w:val="22"/>
+        </w:rPr>
+        <w:t>so</w:t>
+      </w:r>
+      <w:proofErr w:type="gramEnd"/>
+      <w:r>
+        <w:rPr>
+          <w:color w:val="000000" w:themeColor="text1"/>
+          <w:sz w:val="22"/>
+          <w:szCs w:val="22"/>
+        </w:rPr>
+        <w:t xml:space="preserve"> for </w:t>
+      </w:r>
+      <w:proofErr w:type="gramStart"/>
+      <w:r>
+        <w:rPr>
+          <w:color w:val="000000" w:themeColor="text1"/>
+          <w:sz w:val="22"/>
+          <w:szCs w:val="22"/>
+        </w:rPr>
+        <w:t>example</w:t>
+      </w:r>
+      <w:proofErr w:type="gramEnd"/>
+      <w:r>
+        <w:rPr>
+          <w:color w:val="000000" w:themeColor="text1"/>
+          <w:sz w:val="22"/>
+          <w:szCs w:val="22"/>
+        </w:rPr>
+        <w:t xml:space="preserve"> ChatInput component should have ChatInput.css </w:t>
+      </w:r>
+    </w:p>
+    <w:p>
+      <w:pPr>
+        <w:rPr>
+          <w:color w:val="000000" w:themeColor="text1"/>
+          <w:sz w:val="22"/>
+          <w:szCs w:val="22"/>
+        </w:rPr>
+      </w:pPr>
+      <w:r>
+        <w:rPr>
+          <w:color w:val="000000" w:themeColor="text1"/>
+          <w:sz w:val="22"/>
+          <w:szCs w:val="22"/>
+        </w:rPr>
+        <w:t>and in the header of the ChatInput we should use import ‘./chatinput.css’;</w:t>
       </w:r>
     </w:p>
     <w:sectPr>
@@ -2999,6 +4463,7 @@
   <w:style w:type="character" w:default="1" w:styleId="DefaultParagraphFont">
     <w:name w:val="Default Paragraph Font"/>
     <w:uiPriority w:val="1"/>
+    <w:semiHidden/>
     <w:unhideWhenUsed/>
   </w:style>
   <w:style w:type="table" w:default="1" w:styleId="TableNormal">
@@ -3342,6 +4807,29 @@
       <w:szCs w:val="20"/>
     </w:rPr>
   </w:style>
+  <w:style w:type="character" w:styleId="Hyperlink">
+    <w:name w:val="Hyperlink"/>
+    <w:basedOn w:val="DefaultParagraphFont"/>
+    <w:uiPriority w:val="99"/>
+    <w:unhideWhenUsed/>
+    <w:rsid w:val="007567A7"/>
+    <w:rPr>
+      <w:color w:val="0563C1" w:themeColor="hyperlink"/>
+      <w:u w:val="single"/>
+    </w:rPr>
+  </w:style>
+  <w:style w:type="character" w:styleId="UnresolvedMention">
+    <w:name w:val="Unresolved Mention"/>
+    <w:basedOn w:val="DefaultParagraphFont"/>
+    <w:uiPriority w:val="99"/>
+    <w:semiHidden/>
+    <w:unhideWhenUsed/>
+    <w:rsid w:val="007567A7"/>
+    <w:rPr>
+      <w:color w:val="605E5C"/>
+      <w:shd w:val="clear" w:color="auto" w:fill="E1DFDD"/>
+    </w:rPr>
+  </w:style>
 </w:styles>
 </file>
 

</xml_diff>